<commit_message>
CRATOS 1.9.1 — código-fonte, testes, manual e updates.json (atualização automática)
- src/: 1.9.1 (1.7 SNIPER, 1.8 PREVJUD, 1.9.0 novidades, indisponibilidade,
  atualização automática, endurecimento, INFOJUD "Recuperar NI"; 1.9.1 CCS).
- updates.json na raiz com a 1.9.1 (SHA-256 do .xpi assinado pela AMO).
- testes/: 43 suítes, 1147 asserções (dados fictícios; a guarda do id do
  SNIPER passa a usar só o hash).
- Manual do usuário atualizado + manual/gerar-manual.js.
- README/LEIA-ME: versão, convênios, privacidade (limpeza ao fechar a aba),
  hosts só https, atualização automática; distribuicao/LEIA-ME.md com a rotina.

Merge só DEPOIS de criar a release v1.9.1 com o arquivo cratos-1.9.1.xpi.

Co-Authored-By: Claude Opus 5.5 <noreply@anthropic.com>
Claude-Session: https://claude.ai/code/session_015YWTevEB4Caz82RVqoCx9k
</commit_message>
<xml_diff>
--- a/CRATOS - Manual do Usuario.docx
+++ b/CRATOS - Manual do Usuario.docx
@@ -71,7 +71,7 @@
           <w:sz w:val="20"/>
           <w:szCs w:val="20"/>
         </w:rPr>
-        <w:t xml:space="preserve">Versão 1.2.8</w:t>
+        <w:t xml:space="preserve">Versão 1.9.1</w:t>
       </w:r>
       <w:r>
         <w:rPr>
@@ -235,7 +235,7 @@
         <w:spacing w:after="120" w:line="276"/>
       </w:pPr>
       <w:r>
-        <w:t xml:space="preserve">O CRATOS é uma extensão para o navegador Firefox que ajuda a executar, a partir de um processo aberto no PJe, as consultas e ordens dos convênios do dia a dia da execução — INFOJUD (eCAC/Receita), SAB (bloqueio/SISBAJUD), RENAJUD, CNIB, CENSEC e SerasaJUD.</w:t>
+        <w:t xml:space="preserve">O CRATOS é uma extensão para o navegador Firefox que ajuda a executar, a partir de um processo aberto no PJe, as consultas e ordens dos convênios do dia a dia da execução — INFOJUD (eCAC/Receita), SAB (bloqueio/SISBAJUD), RENAJUD, CNIB, CENSEC, SerasaJUD, CCS (Banco Central), SNIPER (investigação patrimonial do CNJ) e PREVJUD (Dossiê Previdenciário do INSS).</w:t>
       </w:r>
     </w:p>
     <w:p>
@@ -512,6 +512,73 @@
             </w:r>
             <w:r>
               <w:t xml:space="preserve"> (.xpi que você recebeu pronto) instala de forma permanente. Se instalar uma versão não assinada, ela some ao fechar o Firefox.</w:t>
+            </w:r>
+          </w:p>
+        </w:tc>
+      </w:tr>
+    </w:tbl>
+    <w:tbl>
+      <w:tblPr>
+        <w:tblW w:type="dxa" w:w="9360"/>
+        <w:tblBorders>
+          <w:top w:val="single" w:color="CBD5E1" w:sz="2"/>
+          <w:left w:val="single" w:color="1F3A5F" w:sz="12"/>
+          <w:bottom w:val="single" w:color="CBD5E1" w:sz="2"/>
+          <w:right w:val="single" w:color="CBD5E1" w:sz="2"/>
+          <w:insideH w:val="none"/>
+          <w:insideV w:val="none"/>
+        </w:tblBorders>
+      </w:tblPr>
+      <w:tblGrid>
+        <w:gridCol w:w="9360"/>
+      </w:tblGrid>
+      <w:tr>
+        <w:tc>
+          <w:tcPr>
+            <w:tcW w:type="dxa" w:w="9360"/>
+            <w:shd w:fill="F2F4F7" w:val="clear"/>
+            <w:tcMar>
+              <w:top w:type="dxa" w:w="120"/>
+              <w:left w:type="dxa" w:w="160"/>
+              <w:bottom w:type="dxa" w:w="120"/>
+              <w:right w:type="dxa" w:w="160"/>
+            </w:tcMar>
+          </w:tcPr>
+          <w:p>
+            <w:pPr>
+              <w:spacing w:after="60"/>
+            </w:pPr>
+            <w:r>
+              <w:rPr>
+                <w:b/>
+                <w:bCs/>
+                <w:color w:val="1F3A5F"/>
+              </w:rPr>
+              <w:t xml:space="preserve">Atualizações automáticas</w:t>
+            </w:r>
+          </w:p>
+          <w:p>
+            <w:pPr>
+              <w:spacing w:after="40" w:line="264"/>
+            </w:pPr>
+            <w:r>
+              <w:t xml:space="preserve">Depois da primeira instalação, você não precisa instalar de novo: as versões novas do CRATOS chegam sozinhas pelo próprio Firefox, que consulta cerca de uma vez por dia a lista de versões publicada pelo responsável pela extensão.</w:t>
+            </w:r>
+          </w:p>
+          <w:p>
+            <w:pPr>
+              <w:spacing w:after="40" w:line="264"/>
+            </w:pPr>
+            <w:r>
+              <w:t xml:space="preserve">Depois de cada atualização, o painel mostra uma vez o cartão "Novidades", com o que mudou (veja 5.11).</w:t>
+            </w:r>
+          </w:p>
+          <w:p>
+            <w:pPr>
+              <w:spacing w:after="40" w:line="264"/>
+            </w:pPr>
+            <w:r>
+              <w:t xml:space="preserve">O CRATOS exige o Firefox 140 ou mais novo.</w:t>
             </w:r>
           </w:p>
         </w:tc>
@@ -590,7 +657,7 @@
         <w:pStyle w:val="ListParagraph"/>
         <w:numPr>
           <w:ilvl w:val="0"/>
-          <w:numId w:val="2"/>
+          <w:numId w:val="3"/>
         </w:numPr>
         <w:spacing w:after="80" w:line="264"/>
       </w:pPr>
@@ -603,12 +670,12 @@
         <w:pStyle w:val="ListParagraph"/>
         <w:numPr>
           <w:ilvl w:val="0"/>
-          <w:numId w:val="2"/>
+          <w:numId w:val="3"/>
         </w:numPr>
         <w:spacing w:after="80" w:line="264"/>
       </w:pPr>
       <w:r>
-        <w:t xml:space="preserve">Clique no ícone do </w:t>
+        <w:t xml:space="preserve">Clique no botão flutuante do </w:t>
       </w:r>
       <w:r>
         <w:rPr>
@@ -618,7 +685,7 @@
         <w:t xml:space="preserve">CRATOS</w:t>
       </w:r>
       <w:r>
-        <w:t xml:space="preserve">. Um painel abre no canto da tela.</w:t>
+        <w:t xml:space="preserve">. Um painel abre no canto da tela. (Você pode arrastar o botão para onde preferir; a posição fica guardada.)</w:t>
       </w:r>
     </w:p>
     <w:p>
@@ -626,7 +693,7 @@
         <w:pStyle w:val="ListParagraph"/>
         <w:numPr>
           <w:ilvl w:val="0"/>
-          <w:numId w:val="2"/>
+          <w:numId w:val="3"/>
         </w:numPr>
         <w:spacing w:after="80" w:line="264"/>
       </w:pPr>
@@ -725,7 +792,7 @@
         <w:spacing w:after="120" w:line="276"/>
       </w:pPr>
       <w:r>
-        <w:t xml:space="preserve">Escolha o que vai fazer: INCLUSÃO (incluir restrições/ordens e fazer consultas) ou BAIXA (retirar restrições). O CRATOS mostra os convênios adequados a cada caso.</w:t>
+        <w:t xml:space="preserve">Escolha o que vai fazer: INCLUSÃO (incluir restrições/ordens e fazer consultas) ou BAIXA (retirar restrições). O CRATOS mostra os convênios adequados a cada caso. As consultas — INFOJUD, CENSEC, CCS, SNIPER e PREVJUD — aparecem na INCLUSÃO; SAB, RENAJUD, CNIB e SerasaJUD aparecem nas duas.</w:t>
       </w:r>
     </w:p>
     <w:p>
@@ -888,6 +955,14 @@
     </w:tbl>
     <w:p>
       <w:pPr>
+        <w:spacing w:after="120" w:line="276"/>
+      </w:pPr>
+      <w:r>
+        <w:t xml:space="preserve">Em alguns convênios (INFOJUD, SNIPER, PREVJUD), enquanto o CRATOS trabalha, a aba do sistema fica coberta por um aviso. Não clique nela até ele terminar.</w:t>
+      </w:r>
+    </w:p>
+    <w:p>
+      <w:pPr>
         <w:pStyle w:val="Heading2"/>
         <w:spacing w:after="100" w:before="240"/>
       </w:pPr>
@@ -900,7 +975,7 @@
         <w:spacing w:after="120" w:line="276"/>
       </w:pPr>
       <w:r>
-        <w:t xml:space="preserve">Quando a fila termina, o painel mostra um resumo: quantos convênios foram concluídos e quais precisam da sua atenção (por exemplo, um que você pulou, ou que voltou incompleto). Esse resumo é a sua conferência rápida — vale sempre ler.</w:t>
+        <w:t xml:space="preserve">Quando a fila termina, o painel mostra um resumo: quantos convênios foram concluídos e quais precisam da sua atenção (por exemplo, um que você pulou, que voltou incompleto ou cujo sistema estava fora do ar). Esse resumo é a sua conferência rápida — vale sempre ler.</w:t>
       </w:r>
     </w:p>
     <w:p>
@@ -922,11 +997,27 @@
     </w:p>
     <w:p>
       <w:pPr>
+        <w:spacing w:after="120" w:line="276"/>
+      </w:pPr>
+      <w:r>
+        <w:t xml:space="preserve">Junto com o INFOJUD, se a opção estiver ligada (veja 6.1), o CRATOS pesquisa antes das solicitações as empresas em que cada executado pessoa física é o responsável ("Recuperar NI – CNPJ") e gera uma certidão consolidada, com o endereço de cada empresa. A pesquisa é feita por trás, com a sua sessão do e-CAC: a tela fica coberta por um aviso enquanto ela roda, e no fim a faixa mostra um resumo (por exemplo, "F.S.: 3 empresas; B.P.: nenhuma").</w:t>
+      </w:r>
+    </w:p>
+    <w:p>
+      <w:pPr>
+        <w:spacing w:after="120" w:line="276"/>
+      </w:pPr>
+      <w:r>
+        <w:t xml:space="preserve">Se só o Recuperar NI estiver marcado (nenhum tipo de declaração ligado), o CRATOS faz apenas essa pesquisa: não abre a tela de solicitação nem consulta a caixa postal, porque a resposta é imediata.</w:t>
+      </w:r>
+    </w:p>
+    <w:p>
+      <w:pPr>
         <w:pStyle w:val="Heading2"/>
         <w:spacing w:after="100" w:before="240"/>
       </w:pPr>
       <w:r>
-        <w:t xml:space="preserve">5.7. Juntar a certidão no processo</w:t>
+        <w:t xml:space="preserve">5.7. Coletas posteriores: CCS e PREVJUD</w:t>
       </w:r>
     </w:p>
     <w:p>
@@ -934,7 +1025,56 @@
         <w:spacing w:after="120" w:line="276"/>
       </w:pPr>
       <w:r>
-        <w:t xml:space="preserve">Ao terminar os convênios, o CRATOS reúne o que foi feito em uma certidão e anexa os comprovantes, criando a minuta no processo. Ele cria a minuta e PARA: conferir, ajustar e assinar é você. Se preferir, use o botão "Juntar certidão dos convênios" para fazer isso quando quiser.</w:t>
+        <w:t xml:space="preserve">Dois convênios também respondem depois, e cada um tem o seu botão na tela inicial do painel:</w:t>
+      </w:r>
+    </w:p>
+    <w:p>
+      <w:pPr>
+        <w:pStyle w:val="ListParagraph"/>
+        <w:numPr>
+          <w:ilvl w:val="0"/>
+          <w:numId w:val="4"/>
+        </w:numPr>
+        <w:spacing w:after="60" w:line="264"/>
+      </w:pPr>
+      <w:r>
+        <w:rPr>
+          <w:b/>
+          <w:bCs/>
+        </w:rPr>
+        <w:t xml:space="preserve">Coletar CCS (respostas das instituições): </w:t>
+      </w:r>
+      <w:r>
+        <w:t xml:space="preserve">no dia seguinte à requisição, junta o PDF de detalhamentos do próprio CCS e uma certidão com quem já respondeu e quem ainda falta responder.</w:t>
+      </w:r>
+    </w:p>
+    <w:p>
+      <w:pPr>
+        <w:pStyle w:val="ListParagraph"/>
+        <w:numPr>
+          <w:ilvl w:val="0"/>
+          <w:numId w:val="4"/>
+        </w:numPr>
+        <w:spacing w:after="60" w:line="264"/>
+      </w:pPr>
+      <w:r>
+        <w:rPr>
+          <w:b/>
+          <w:bCs/>
+        </w:rPr>
+        <w:t xml:space="preserve">Coletar PREVJUD (dossiês em processamento): </w:t>
+      </w:r>
+      <w:r>
+        <w:t xml:space="preserve">busca os dossiês prontos do processo (pedidos dos últimos 7 dias) e junta os PDFs do INSS, mesmo que já tenham sido juntados antes.</w:t>
+      </w:r>
+    </w:p>
+    <w:p>
+      <w:pPr>
+        <w:pStyle w:val="Heading2"/>
+        <w:spacing w:after="100" w:before="240"/>
+      </w:pPr>
+      <w:r>
+        <w:t xml:space="preserve">5.8. Sistema fora do ar: certidão de indisponibilidade</w:t>
       </w:r>
     </w:p>
     <w:p>
@@ -942,7 +1082,15 @@
         <w:spacing w:after="120" w:line="276"/>
       </w:pPr>
       <w:r>
-        <w:t xml:space="preserve">Ao criar a certidão, o CRATOS também libera a visibilidade do documento para as partes do processo (você escolhe quais polos nas Preferências — veja 6.7).</w:t>
+        <w:t xml:space="preserve">Na tela inicial do painel, escolha um convênio e clique em "Verificar disponibilidade do convênio". O CRATOS faz até 3 tentativas, testa o próprio PJe como controle e mostra o resultado. Se o sistema estiver mesmo fora do ar, aparece o botão para gerar a certidão de indisponibilidade — só com a sua confirmação.</w:t>
+      </w:r>
+    </w:p>
+    <w:p>
+      <w:pPr>
+        <w:spacing w:after="120" w:line="276"/>
+      </w:pPr>
+      <w:r>
+        <w:t xml:space="preserve">Durante a fila, se um convênio falha ou fica sem resposta, o CRATOS faz essa verificação sozinho e, se for o caso, oferece a certidão.</w:t>
       </w:r>
     </w:p>
     <w:tbl>
@@ -982,7 +1130,7 @@
                 <w:bCs/>
                 <w:color w:val="8A6D00"/>
               </w:rPr>
-              <w:t xml:space="preserve">Importante</w:t>
+              <w:t xml:space="preserve">Observação</w:t>
             </w:r>
           </w:p>
           <w:p>
@@ -990,6 +1138,90 @@
               <w:spacing w:after="40" w:line="264"/>
             </w:pPr>
             <w:r>
+              <w:t xml:space="preserve">A certidão relata as tentativas, com hora e retorno, sem afirmar a causa, e diz que a diligência deve ser repetida. Se nem o PJe responder, o problema pode ser a rede da unidade, e o CRATOS não oferece certidão.</w:t>
+            </w:r>
+          </w:p>
+        </w:tc>
+      </w:tr>
+    </w:tbl>
+    <w:p>
+      <w:pPr>
+        <w:pStyle w:val="Heading2"/>
+        <w:spacing w:after="100" w:before="240"/>
+      </w:pPr>
+      <w:r>
+        <w:t xml:space="preserve">5.9. Juntar a certidão no processo</w:t>
+      </w:r>
+    </w:p>
+    <w:p>
+      <w:pPr>
+        <w:spacing w:after="120" w:line="276"/>
+      </w:pPr>
+      <w:r>
+        <w:t xml:space="preserve">Ao terminar os convênios, o CRATOS reúne o que foi feito em uma certidão e anexa os comprovantes, criando a minuta no processo. Ele cria a minuta e PARA: conferir, ajustar e assinar é você. Se preferir, use o botão "Juntar certidão dos convênios" para fazer isso quando quiser.</w:t>
+      </w:r>
+    </w:p>
+    <w:p>
+      <w:pPr>
+        <w:spacing w:after="120" w:line="276"/>
+      </w:pPr>
+      <w:r>
+        <w:t xml:space="preserve">Inclusões e consultas saem numa certidão; cancelamentos de restrição, em outra; sistemas indisponíveis, numa terceira. Na baixa, quando o convênio não encontra restrição ativa para cancelar (CNIB e RENAJUD), também sai certidão, dizendo isso.</w:t>
+      </w:r>
+    </w:p>
+    <w:p>
+      <w:pPr>
+        <w:spacing w:after="120" w:line="276"/>
+      </w:pPr>
+      <w:r>
+        <w:t xml:space="preserve">Ao criar a certidão, o CRATOS também libera a visibilidade do documento para as partes do processo (você escolhe quais polos nas Preferências — veja 6.10).</w:t>
+      </w:r>
+    </w:p>
+    <w:tbl>
+      <w:tblPr>
+        <w:tblW w:type="dxa" w:w="9360"/>
+        <w:tblBorders>
+          <w:top w:val="single" w:color="E6B800" w:sz="2"/>
+          <w:left w:val="single" w:color="E6B800" w:sz="12"/>
+          <w:bottom w:val="single" w:color="E6B800" w:sz="2"/>
+          <w:right w:val="single" w:color="E6B800" w:sz="2"/>
+          <w:insideH w:val="none"/>
+          <w:insideV w:val="none"/>
+        </w:tblBorders>
+      </w:tblPr>
+      <w:tblGrid>
+        <w:gridCol w:w="9360"/>
+      </w:tblGrid>
+      <w:tr>
+        <w:tc>
+          <w:tcPr>
+            <w:tcW w:type="dxa" w:w="9360"/>
+            <w:shd w:fill="FFF4CE" w:val="clear"/>
+            <w:tcMar>
+              <w:top w:type="dxa" w:w="120"/>
+              <w:left w:type="dxa" w:w="160"/>
+              <w:bottom w:type="dxa" w:w="120"/>
+              <w:right w:type="dxa" w:w="160"/>
+            </w:tcMar>
+          </w:tcPr>
+          <w:p>
+            <w:pPr>
+              <w:spacing w:after="60"/>
+            </w:pPr>
+            <w:r>
+              <w:rPr>
+                <w:b/>
+                <w:bCs/>
+                <w:color w:val="8A6D00"/>
+              </w:rPr>
+              <w:t xml:space="preserve">Importante</w:t>
+            </w:r>
+          </w:p>
+          <w:p>
+            <w:pPr>
+              <w:spacing w:after="40" w:line="264"/>
+            </w:pPr>
+            <w:r>
               <w:t xml:space="preserve">Depois que a minuta é criada, </w:t>
             </w:r>
             <w:r>
@@ -1006,6 +1238,109 @@
         </w:tc>
       </w:tr>
     </w:tbl>
+    <w:p>
+      <w:pPr>
+        <w:pStyle w:val="Heading2"/>
+        <w:spacing w:after="100" w:before="240"/>
+      </w:pPr>
+      <w:r>
+        <w:t xml:space="preserve">5.10. Junte antes de fechar a aba do processo</w:t>
+      </w:r>
+    </w:p>
+    <w:p>
+      <w:pPr>
+        <w:spacing w:after="120" w:line="276"/>
+      </w:pPr>
+      <w:r>
+        <w:t xml:space="preserve">Por privacidade, os dados de cada processo ficam guardados só enquanto a aba dele estiver aberta. Ao fechar a aba, o CRATOS apaga tudo o que guardou daquele processo — inclusive a lista de arquivos para a juntada. O que sobrar é apagado quando o Firefox abre.</w:t>
+      </w:r>
+    </w:p>
+    <w:tbl>
+      <w:tblPr>
+        <w:tblW w:type="dxa" w:w="9360"/>
+        <w:tblBorders>
+          <w:top w:val="single" w:color="E6B800" w:sz="2"/>
+          <w:left w:val="single" w:color="E6B800" w:sz="12"/>
+          <w:bottom w:val="single" w:color="E6B800" w:sz="2"/>
+          <w:right w:val="single" w:color="E6B800" w:sz="2"/>
+          <w:insideH w:val="none"/>
+          <w:insideV w:val="none"/>
+        </w:tblBorders>
+      </w:tblPr>
+      <w:tblGrid>
+        <w:gridCol w:w="9360"/>
+      </w:tblGrid>
+      <w:tr>
+        <w:tc>
+          <w:tcPr>
+            <w:tcW w:type="dxa" w:w="9360"/>
+            <w:shd w:fill="FFF4CE" w:val="clear"/>
+            <w:tcMar>
+              <w:top w:type="dxa" w:w="120"/>
+              <w:left w:type="dxa" w:w="160"/>
+              <w:bottom w:type="dxa" w:w="120"/>
+              <w:right w:type="dxa" w:w="160"/>
+            </w:tcMar>
+          </w:tcPr>
+          <w:p>
+            <w:pPr>
+              <w:spacing w:after="60"/>
+            </w:pPr>
+            <w:r>
+              <w:rPr>
+                <w:b/>
+                <w:bCs/>
+                <w:color w:val="8A6D00"/>
+              </w:rPr>
+              <w:t xml:space="preserve">Na prática</w:t>
+            </w:r>
+          </w:p>
+          <w:p>
+            <w:pPr>
+              <w:spacing w:after="40" w:line="264"/>
+            </w:pPr>
+            <w:r>
+              <w:t xml:space="preserve">Faça a juntada </w:t>
+            </w:r>
+            <w:r>
+              <w:rPr>
+                <w:b/>
+                <w:bCs/>
+              </w:rPr>
+              <w:t xml:space="preserve">antes</w:t>
+            </w:r>
+            <w:r>
+              <w:t xml:space="preserve"> de fechar a aba do processo. Se houver arquivo do CRATOS ainda não juntado, o Firefox pergunta se você quer mesmo sair da página.</w:t>
+            </w:r>
+          </w:p>
+          <w:p>
+            <w:pPr>
+              <w:spacing w:after="40" w:line="264"/>
+            </w:pPr>
+            <w:r>
+              <w:t xml:space="preserve">Se fechar sem juntar, os arquivos continuam na sua pasta de downloads, mas o CRATOS não os oferece mais para juntada: anexe à mão ou refaça o convênio.</w:t>
+            </w:r>
+          </w:p>
+        </w:tc>
+      </w:tr>
+    </w:tbl>
+    <w:p>
+      <w:pPr>
+        <w:pStyle w:val="Heading2"/>
+        <w:spacing w:after="100" w:before="240"/>
+      </w:pPr>
+      <w:r>
+        <w:t xml:space="preserve">5.11. Novidades da versão</w:t>
+      </w:r>
+    </w:p>
+    <w:p>
+      <w:pPr>
+        <w:spacing w:after="120" w:line="276"/>
+      </w:pPr>
+      <w:r>
+        <w:t xml:space="preserve">Depois de cada atualização, o painel mostra uma vez o cartão "Novidades", com o que mudou. Clique em "Entendi" para fechar; "ver versões anteriores" mostra o histórico. O mesmo histórico está nas Preferências, no botão "Ver novidades das versões" (veja 6.11).</w:t>
+      </w:r>
+    </w:p>
     <w:p>
       <w:r>
         <w:br w:type="page"/>
@@ -1350,7 +1685,7 @@
                 <w:sz w:val="19"/>
                 <w:szCs w:val="19"/>
               </w:rPr>
-              <w:t xml:space="preserve">Vara</w:t>
+              <w:t xml:space="preserve">Opções do eFinanceira</w:t>
             </w:r>
           </w:p>
         </w:tc>
@@ -1371,7 +1706,7 @@
                 <w:sz w:val="19"/>
                 <w:szCs w:val="19"/>
               </w:rPr>
-              <w:t xml:space="preserve">A vara que assina a solicitação no eCAC. Escolha a sua na lista.</w:t>
+              <w:t xml:space="preserve">Tipo de conta, tipo de relação, exibir câmbio e tipo de extrato — separadas para CPF e CNPJ. O padrão é o relatório detalhado: Todas, Todas, Sim, Contas e movimentações.</w:t>
             </w:r>
           </w:p>
         </w:tc>
@@ -1395,7 +1730,7 @@
                 <w:sz w:val="19"/>
                 <w:szCs w:val="19"/>
               </w:rPr>
-              <w:t xml:space="preserve">—</w:t>
+              <w:t xml:space="preserve">Detalhado</w:t>
             </w:r>
           </w:p>
         </w:tc>
@@ -1420,7 +1755,7 @@
                 <w:sz w:val="19"/>
                 <w:szCs w:val="19"/>
               </w:rPr>
-              <w:t xml:space="preserve">Tipo de processo</w:t>
+              <w:t xml:space="preserve">Recuperar NI (no quadro CPF)</w:t>
             </w:r>
           </w:p>
         </w:tc>
@@ -1441,7 +1776,7 @@
                 <w:sz w:val="19"/>
                 <w:szCs w:val="19"/>
               </w:rPr>
-              <w:t xml:space="preserve">Como o eCAC classifica o pedido.</w:t>
+              <w:t xml:space="preserve">Antes das solicitações, pesquisa as empresas em que cada executado pessoa física é o responsável e expede uma certidão consolidada, com o endereço de cada empresa.</w:t>
             </w:r>
           </w:p>
         </w:tc>
@@ -1465,7 +1800,7 @@
                 <w:sz w:val="19"/>
                 <w:szCs w:val="19"/>
               </w:rPr>
-              <w:t xml:space="preserve">Ação Trabalhista</w:t>
+              <w:t xml:space="preserve">Ligado</w:t>
             </w:r>
           </w:p>
         </w:tc>
@@ -1490,7 +1825,7 @@
                 <w:sz w:val="19"/>
                 <w:szCs w:val="19"/>
               </w:rPr>
-              <w:t xml:space="preserve">Colheita ao fim da fila</w:t>
+              <w:t xml:space="preserve">Vara</w:t>
             </w:r>
           </w:p>
         </w:tc>
@@ -1511,7 +1846,7 @@
                 <w:sz w:val="19"/>
                 <w:szCs w:val="19"/>
               </w:rPr>
-              <w:t xml:space="preserve">Se o CRATOS busca sozinho as respostas na caixa postal ao terminar (colher), só avisa (verificar) ou não faz nada.</w:t>
+              <w:t xml:space="preserve">A vara que assina a solicitação no eCAC. Escolha a sua na lista.</w:t>
             </w:r>
           </w:p>
         </w:tc>
@@ -1535,7 +1870,287 @@
                 <w:sz w:val="19"/>
                 <w:szCs w:val="19"/>
               </w:rPr>
-              <w:t xml:space="preserve">colher</w:t>
+              <w:t xml:space="preserve">—</w:t>
+            </w:r>
+          </w:p>
+        </w:tc>
+      </w:tr>
+      <w:tr>
+        <w:tc>
+          <w:tcPr>
+            <w:tcW w:type="dxa" w:w="2600"/>
+            <w:shd w:fill="F2F4F7" w:val="clear"/>
+            <w:tcMar>
+              <w:top w:type="dxa" w:w="60"/>
+              <w:left w:type="dxa" w:w="100"/>
+              <w:bottom w:type="dxa" w:w="60"/>
+              <w:right w:type="dxa" w:w="100"/>
+            </w:tcMar>
+          </w:tcPr>
+          <w:p>
+            <w:r>
+              <w:rPr>
+                <w:b/>
+                <w:bCs/>
+                <w:sz w:val="19"/>
+                <w:szCs w:val="19"/>
+              </w:rPr>
+              <w:t xml:space="preserve">Tipo de processo</w:t>
+            </w:r>
+          </w:p>
+        </w:tc>
+        <w:tc>
+          <w:tcPr>
+            <w:tcW w:type="dxa" w:w="5560"/>
+            <w:shd w:fill="F2F4F7" w:val="clear"/>
+            <w:tcMar>
+              <w:top w:type="dxa" w:w="60"/>
+              <w:left w:type="dxa" w:w="100"/>
+              <w:bottom w:type="dxa" w:w="60"/>
+              <w:right w:type="dxa" w:w="100"/>
+            </w:tcMar>
+          </w:tcPr>
+          <w:p>
+            <w:r>
+              <w:rPr>
+                <w:sz w:val="19"/>
+                <w:szCs w:val="19"/>
+              </w:rPr>
+              <w:t xml:space="preserve">Como o eCAC classifica o pedido.</w:t>
+            </w:r>
+          </w:p>
+        </w:tc>
+        <w:tc>
+          <w:tcPr>
+            <w:tcW w:type="dxa" w:w="1200"/>
+            <w:shd w:fill="F2F4F7" w:val="clear"/>
+            <w:tcMar>
+              <w:top w:type="dxa" w:w="60"/>
+              <w:left w:type="dxa" w:w="100"/>
+              <w:bottom w:type="dxa" w:w="60"/>
+              <w:right w:type="dxa" w:w="100"/>
+            </w:tcMar>
+          </w:tcPr>
+          <w:p>
+            <w:r>
+              <w:rPr>
+                <w:i/>
+                <w:iCs/>
+                <w:color w:val="6B7280"/>
+                <w:sz w:val="19"/>
+                <w:szCs w:val="19"/>
+              </w:rPr>
+              <w:t xml:space="preserve">Ação Trabalhista</w:t>
+            </w:r>
+          </w:p>
+        </w:tc>
+      </w:tr>
+      <w:tr>
+        <w:tc>
+          <w:tcPr>
+            <w:tcW w:type="dxa" w:w="2600"/>
+            <w:shd w:fill="FFFFFF" w:val="clear"/>
+            <w:tcMar>
+              <w:top w:type="dxa" w:w="60"/>
+              <w:left w:type="dxa" w:w="100"/>
+              <w:bottom w:type="dxa" w:w="60"/>
+              <w:right w:type="dxa" w:w="100"/>
+            </w:tcMar>
+          </w:tcPr>
+          <w:p>
+            <w:r>
+              <w:rPr>
+                <w:b/>
+                <w:bCs/>
+                <w:sz w:val="19"/>
+                <w:szCs w:val="19"/>
+              </w:rPr>
+              <w:t xml:space="preserve">Justificativa</w:t>
+            </w:r>
+          </w:p>
+        </w:tc>
+        <w:tc>
+          <w:tcPr>
+            <w:tcW w:type="dxa" w:w="5560"/>
+            <w:shd w:fill="FFFFFF" w:val="clear"/>
+            <w:tcMar>
+              <w:top w:type="dxa" w:w="60"/>
+              <w:left w:type="dxa" w:w="100"/>
+              <w:bottom w:type="dxa" w:w="60"/>
+              <w:right w:type="dxa" w:w="100"/>
+            </w:tcMar>
+          </w:tcPr>
+          <w:p>
+            <w:r>
+              <w:rPr>
+                <w:sz w:val="19"/>
+                <w:szCs w:val="19"/>
+              </w:rPr>
+              <w:t xml:space="preserve">Texto da justificativa no eCAC.</w:t>
+            </w:r>
+          </w:p>
+        </w:tc>
+        <w:tc>
+          <w:tcPr>
+            <w:tcW w:type="dxa" w:w="1200"/>
+            <w:shd w:fill="FFFFFF" w:val="clear"/>
+            <w:tcMar>
+              <w:top w:type="dxa" w:w="60"/>
+              <w:left w:type="dxa" w:w="100"/>
+              <w:bottom w:type="dxa" w:w="60"/>
+              <w:right w:type="dxa" w:w="100"/>
+            </w:tcMar>
+          </w:tcPr>
+          <w:p>
+            <w:r>
+              <w:rPr>
+                <w:i/>
+                <w:iCs/>
+                <w:color w:val="6B7280"/>
+                <w:sz w:val="19"/>
+                <w:szCs w:val="19"/>
+              </w:rPr>
+              <w:t xml:space="preserve">execução</w:t>
+            </w:r>
+          </w:p>
+        </w:tc>
+      </w:tr>
+      <w:tr>
+        <w:tc>
+          <w:tcPr>
+            <w:tcW w:type="dxa" w:w="2600"/>
+            <w:shd w:fill="F2F4F7" w:val="clear"/>
+            <w:tcMar>
+              <w:top w:type="dxa" w:w="60"/>
+              <w:left w:type="dxa" w:w="100"/>
+              <w:bottom w:type="dxa" w:w="60"/>
+              <w:right w:type="dxa" w:w="100"/>
+            </w:tcMar>
+          </w:tcPr>
+          <w:p>
+            <w:r>
+              <w:rPr>
+                <w:b/>
+                <w:bCs/>
+                <w:sz w:val="19"/>
+                <w:szCs w:val="19"/>
+              </w:rPr>
+              <w:t xml:space="preserve">Magistrado</w:t>
+            </w:r>
+          </w:p>
+        </w:tc>
+        <w:tc>
+          <w:tcPr>
+            <w:tcW w:type="dxa" w:w="5560"/>
+            <w:shd w:fill="F2F4F7" w:val="clear"/>
+            <w:tcMar>
+              <w:top w:type="dxa" w:w="60"/>
+              <w:left w:type="dxa" w:w="100"/>
+              <w:bottom w:type="dxa" w:w="60"/>
+              <w:right w:type="dxa" w:w="100"/>
+            </w:tcMar>
+          </w:tcPr>
+          <w:p>
+            <w:r>
+              <w:rPr>
+                <w:sz w:val="19"/>
+                <w:szCs w:val="19"/>
+              </w:rPr>
+              <w:t xml:space="preserve">Nome do magistrado no eCAC (opcional).</w:t>
+            </w:r>
+          </w:p>
+        </w:tc>
+        <w:tc>
+          <w:tcPr>
+            <w:tcW w:type="dxa" w:w="1200"/>
+            <w:shd w:fill="F2F4F7" w:val="clear"/>
+            <w:tcMar>
+              <w:top w:type="dxa" w:w="60"/>
+              <w:left w:type="dxa" w:w="100"/>
+              <w:bottom w:type="dxa" w:w="60"/>
+              <w:right w:type="dxa" w:w="100"/>
+            </w:tcMar>
+          </w:tcPr>
+          <w:p>
+            <w:r>
+              <w:rPr>
+                <w:i/>
+                <w:iCs/>
+                <w:color w:val="6B7280"/>
+                <w:sz w:val="19"/>
+                <w:szCs w:val="19"/>
+              </w:rPr>
+              <w:t xml:space="preserve">—</w:t>
+            </w:r>
+          </w:p>
+        </w:tc>
+      </w:tr>
+      <w:tr>
+        <w:tc>
+          <w:tcPr>
+            <w:tcW w:type="dxa" w:w="2600"/>
+            <w:shd w:fill="FFFFFF" w:val="clear"/>
+            <w:tcMar>
+              <w:top w:type="dxa" w:w="60"/>
+              <w:left w:type="dxa" w:w="100"/>
+              <w:bottom w:type="dxa" w:w="60"/>
+              <w:right w:type="dxa" w:w="100"/>
+            </w:tcMar>
+          </w:tcPr>
+          <w:p>
+            <w:r>
+              <w:rPr>
+                <w:b/>
+                <w:bCs/>
+                <w:sz w:val="19"/>
+                <w:szCs w:val="19"/>
+              </w:rPr>
+              <w:t xml:space="preserve">Ao terminar a fila</w:t>
+            </w:r>
+          </w:p>
+        </w:tc>
+        <w:tc>
+          <w:tcPr>
+            <w:tcW w:type="dxa" w:w="5560"/>
+            <w:shd w:fill="FFFFFF" w:val="clear"/>
+            <w:tcMar>
+              <w:top w:type="dxa" w:w="60"/>
+              <w:left w:type="dxa" w:w="100"/>
+              <w:bottom w:type="dxa" w:w="60"/>
+              <w:right w:type="dxa" w:w="100"/>
+            </w:tcMar>
+          </w:tcPr>
+          <w:p>
+            <w:r>
+              <w:rPr>
+                <w:sz w:val="19"/>
+                <w:szCs w:val="19"/>
+              </w:rPr>
+              <w:t xml:space="preserve">Se o CRATOS verifica e colhe sozinho as respostas na caixa postal, só verifica e oferece o botão de colher, ou não verifica.</w:t>
+            </w:r>
+          </w:p>
+        </w:tc>
+        <w:tc>
+          <w:tcPr>
+            <w:tcW w:type="dxa" w:w="1200"/>
+            <w:shd w:fill="FFFFFF" w:val="clear"/>
+            <w:tcMar>
+              <w:top w:type="dxa" w:w="60"/>
+              <w:left w:type="dxa" w:w="100"/>
+              <w:bottom w:type="dxa" w:w="60"/>
+              <w:right w:type="dxa" w:w="100"/>
+            </w:tcMar>
+          </w:tcPr>
+          <w:p>
+            <w:r>
+              <w:rPr>
+                <w:i/>
+                <w:iCs/>
+                <w:color w:val="6B7280"/>
+                <w:sz w:val="19"/>
+                <w:szCs w:val="19"/>
+              </w:rPr>
+              <w:t xml:space="preserve">Verificar e colher</w:t>
             </w:r>
           </w:p>
         </w:tc>
@@ -1657,6 +2272,21 @@
             </w:pPr>
             <w:r>
               <w:t xml:space="preserve">A eFinanceira é assíncrona: a resposta pode demorar. Isso é do sistema, não da extensão.</w:t>
+            </w:r>
+          </w:p>
+          <w:p>
+            <w:pPr>
+              <w:spacing w:after="40" w:line="264"/>
+            </w:pPr>
+            <w:r>
+              <w:rPr>
+                <w:b/>
+                <w:bCs/>
+              </w:rPr>
+              <w:t xml:space="preserve">Recuperar NI: </w:t>
+            </w:r>
+            <w:r>
+              <w:t xml:space="preserve">se o INFOJUD avisar que há mais de 50 empresas, o CRATOS refaz a pesquisa por UF (27 pesquisas, cerca de um minuto). Se a consulta falhar, a certidão diz que não pôde ser concluída e deve ser repetida — nunca que não há empresas.</w:t>
             </w:r>
           </w:p>
           <w:p>
@@ -2536,7 +3166,7 @@
                 <w:sz w:val="19"/>
                 <w:szCs w:val="19"/>
               </w:rPr>
-              <w:t xml:space="preserve">O tribunal que aparece nos Dados do Processo.</w:t>
+              <w:t xml:space="preserve">O tribunal que aparece nos Dados do Processo (lista com todos os TRTs).</w:t>
             </w:r>
           </w:p>
         </w:tc>
@@ -2771,6 +3401,57 @@
                 <w:szCs w:val="19"/>
               </w:rPr>
               <w:t xml:space="preserve">Justiça do Trabalho</w:t>
+            </w:r>
+          </w:p>
+        </w:tc>
+      </w:tr>
+    </w:tbl>
+    <w:tbl>
+      <w:tblPr>
+        <w:tblW w:type="dxa" w:w="9360"/>
+        <w:tblBorders>
+          <w:top w:val="single" w:color="CBD5E1" w:sz="2"/>
+          <w:left w:val="single" w:color="1F3A5F" w:sz="12"/>
+          <w:bottom w:val="single" w:color="CBD5E1" w:sz="2"/>
+          <w:right w:val="single" w:color="CBD5E1" w:sz="2"/>
+          <w:insideH w:val="none"/>
+          <w:insideV w:val="none"/>
+        </w:tblBorders>
+      </w:tblPr>
+      <w:tblGrid>
+        <w:gridCol w:w="9360"/>
+      </w:tblGrid>
+      <w:tr>
+        <w:tc>
+          <w:tcPr>
+            <w:tcW w:type="dxa" w:w="9360"/>
+            <w:shd w:fill="F2F4F7" w:val="clear"/>
+            <w:tcMar>
+              <w:top w:type="dxa" w:w="120"/>
+              <w:left w:type="dxa" w:w="160"/>
+              <w:bottom w:type="dxa" w:w="120"/>
+              <w:right w:type="dxa" w:w="160"/>
+            </w:tcMar>
+          </w:tcPr>
+          <w:p>
+            <w:pPr>
+              <w:spacing w:after="60"/>
+            </w:pPr>
+            <w:r>
+              <w:rPr>
+                <w:b/>
+                <w:bCs/>
+                <w:color w:val="1F3A5F"/>
+              </w:rPr>
+              <w:t xml:space="preserve">Observação do RENAJUD</w:t>
+            </w:r>
+          </w:p>
+          <w:p>
+            <w:pPr>
+              <w:spacing w:after="40" w:line="264"/>
+            </w:pPr>
+            <w:r>
+              <w:t xml:space="preserve">Na baixa, se o RENAJUD não encontrar restrição ativa para cancelar, o CRATOS gera certidão dizendo isso.</w:t>
             </w:r>
           </w:p>
         </w:tc>
@@ -3363,6 +4044,14 @@
               <w:t xml:space="preserve">, fora da extensão: escolher quais matrículas saem é decisão jurídica caso a caso.</w:t>
             </w:r>
           </w:p>
+          <w:p>
+            <w:pPr>
+              <w:spacing w:after="40" w:line="264"/>
+            </w:pPr>
+            <w:r>
+              <w:t xml:space="preserve">No cancelamento, se não houver ordem ativa a cancelar (não localizada ou já cancelada), o CRATOS gera certidão dizendo isso.</w:t>
+            </w:r>
+          </w:p>
         </w:tc>
       </w:tr>
     </w:tbl>
@@ -3559,7 +4248,7 @@
                 <w:sz w:val="19"/>
                 <w:szCs w:val="19"/>
               </w:rPr>
-              <w:t xml:space="preserve">Pasta de download</w:t>
+              <w:t xml:space="preserve">Listar as partes de cada ato</w:t>
             </w:r>
           </w:p>
         </w:tc>
@@ -3580,7 +4269,7 @@
                 <w:sz w:val="19"/>
                 <w:szCs w:val="19"/>
               </w:rPr>
-              <w:t xml:space="preserve">Subpasta onde os arquivos são salvos.</w:t>
+              <w:t xml:space="preserve">Inclui na certidão as partes de cada ato (nome, CPF/CNPJ e qualidade).</w:t>
             </w:r>
           </w:p>
         </w:tc>
@@ -3588,6 +4277,76 @@
           <w:tcPr>
             <w:tcW w:type="dxa" w:w="1200"/>
             <w:shd w:fill="F2F4F7" w:val="clear"/>
+            <w:tcMar>
+              <w:top w:type="dxa" w:w="60"/>
+              <w:left w:type="dxa" w:w="100"/>
+              <w:bottom w:type="dxa" w:w="60"/>
+              <w:right w:type="dxa" w:w="100"/>
+            </w:tcMar>
+          </w:tcPr>
+          <w:p>
+            <w:r>
+              <w:rPr>
+                <w:i/>
+                <w:iCs/>
+                <w:color w:val="6B7280"/>
+                <w:sz w:val="19"/>
+                <w:szCs w:val="19"/>
+              </w:rPr>
+              <w:t xml:space="preserve">Desligado</w:t>
+            </w:r>
+          </w:p>
+        </w:tc>
+      </w:tr>
+      <w:tr>
+        <w:tc>
+          <w:tcPr>
+            <w:tcW w:type="dxa" w:w="2600"/>
+            <w:shd w:fill="FFFFFF" w:val="clear"/>
+            <w:tcMar>
+              <w:top w:type="dxa" w:w="60"/>
+              <w:left w:type="dxa" w:w="100"/>
+              <w:bottom w:type="dxa" w:w="60"/>
+              <w:right w:type="dxa" w:w="100"/>
+            </w:tcMar>
+          </w:tcPr>
+          <w:p>
+            <w:r>
+              <w:rPr>
+                <w:b/>
+                <w:bCs/>
+                <w:sz w:val="19"/>
+                <w:szCs w:val="19"/>
+              </w:rPr>
+              <w:t xml:space="preserve">Pasta de download</w:t>
+            </w:r>
+          </w:p>
+        </w:tc>
+        <w:tc>
+          <w:tcPr>
+            <w:tcW w:type="dxa" w:w="5560"/>
+            <w:shd w:fill="FFFFFF" w:val="clear"/>
+            <w:tcMar>
+              <w:top w:type="dxa" w:w="60"/>
+              <w:left w:type="dxa" w:w="100"/>
+              <w:bottom w:type="dxa" w:w="60"/>
+              <w:right w:type="dxa" w:w="100"/>
+            </w:tcMar>
+          </w:tcPr>
+          <w:p>
+            <w:r>
+              <w:rPr>
+                <w:sz w:val="19"/>
+                <w:szCs w:val="19"/>
+              </w:rPr>
+              <w:t xml:space="preserve">Subpasta onde os arquivos são salvos.</w:t>
+            </w:r>
+          </w:p>
+        </w:tc>
+        <w:tc>
+          <w:tcPr>
+            <w:tcW w:type="dxa" w:w="1200"/>
+            <w:shd w:fill="FFFFFF" w:val="clear"/>
             <w:tcMar>
               <w:top w:type="dxa" w:w="60"/>
               <w:left w:type="dxa" w:w="100"/>
@@ -4190,6 +4949,14 @@
               <w:t xml:space="preserve">se você marcar uma parte do polo ativo, ela entra (a marcação é sua), mas com aviso em vermelho na tela.</w:t>
             </w:r>
           </w:p>
+          <w:p>
+            <w:pPr>
+              <w:spacing w:after="40" w:line="264"/>
+            </w:pPr>
+            <w:r>
+              <w:t xml:space="preserve">Se o processo não tiver cálculo do PJe-Calc, o CRATOS abre uma janela e espera, sem prazo, você informar o valor (e, na baixa, a data da dívida) à mão. A certidão registra que o dado foi informado por você.</w:t>
+            </w:r>
+          </w:p>
         </w:tc>
       </w:tr>
     </w:tbl>
@@ -4199,7 +4966,7 @@
         <w:spacing w:after="100" w:before="240"/>
       </w:pPr>
       <w:r>
-        <w:t xml:space="preserve">6.7. Juntada da certidão</w:t>
+        <w:t xml:space="preserve">6.7. CCS (Banco Central)</w:t>
       </w:r>
     </w:p>
     <w:tbl>
@@ -4316,7 +5083,7 @@
                 <w:sz w:val="19"/>
                 <w:szCs w:val="19"/>
               </w:rPr>
-              <w:t xml:space="preserve">Ao terminar os convênios</w:t>
+              <w:t xml:space="preserve">Aceitar o Termo de Uso</w:t>
             </w:r>
           </w:p>
         </w:tc>
@@ -4337,7 +5104,7 @@
                 <w:sz w:val="19"/>
                 <w:szCs w:val="19"/>
               </w:rPr>
-              <w:t xml:space="preserve">Criar a minuta da certidão automaticamente, ou deixar para você criar pelo botão do painel.</w:t>
+              <w:t xml:space="preserve">Se o CRATOS aceita o termo por você ou para para você aceitar.</w:t>
             </w:r>
           </w:p>
         </w:tc>
@@ -4361,7 +5128,7 @@
                 <w:sz w:val="19"/>
                 <w:szCs w:val="19"/>
               </w:rPr>
-              <w:t xml:space="preserve">Criar</w:t>
+              <w:t xml:space="preserve">Não (para)</w:t>
             </w:r>
           </w:p>
         </w:tc>
@@ -4386,7 +5153,7 @@
                 <w:sz w:val="19"/>
                 <w:szCs w:val="19"/>
               </w:rPr>
-              <w:t xml:space="preserve">Dar visibilidade às partes</w:t>
+              <w:t xml:space="preserve">Enviar o detalhamento</w:t>
             </w:r>
           </w:p>
         </w:tc>
@@ -4407,7 +5174,7 @@
                 <w:sz w:val="19"/>
                 <w:szCs w:val="19"/>
               </w:rPr>
-              <w:t xml:space="preserve">Liberar a certidão para o polo ativo e/ou o polo passivo. Marcando os dois, todas as partes enxergam.</w:t>
+              <w:t xml:space="preserve">Se marca os relacionamentos e envia sozinho (só se a marcação sair limpa) ou marca e para para você clicar.</w:t>
             </w:r>
           </w:p>
         </w:tc>
@@ -4431,12 +5198,1453 @@
                 <w:sz w:val="19"/>
                 <w:szCs w:val="19"/>
               </w:rPr>
+              <w:t xml:space="preserve">Não (para)</w:t>
+            </w:r>
+          </w:p>
+        </w:tc>
+      </w:tr>
+      <w:tr>
+        <w:tc>
+          <w:tcPr>
+            <w:tcW w:type="dxa" w:w="2600"/>
+            <w:shd w:fill="FFFFFF" w:val="clear"/>
+            <w:tcMar>
+              <w:top w:type="dxa" w:w="60"/>
+              <w:left w:type="dxa" w:w="100"/>
+              <w:bottom w:type="dxa" w:w="60"/>
+              <w:right w:type="dxa" w:w="100"/>
+            </w:tcMar>
+          </w:tcPr>
+          <w:p>
+            <w:r>
+              <w:rPr>
+                <w:b/>
+                <w:bCs/>
+                <w:sz w:val="19"/>
+                <w:szCs w:val="19"/>
+              </w:rPr>
+              <w:t xml:space="preserve">Quais relacionamentos detalhar</w:t>
+            </w:r>
+          </w:p>
+        </w:tc>
+        <w:tc>
+          <w:tcPr>
+            <w:tcW w:type="dxa" w:w="5560"/>
+            <w:shd w:fill="FFFFFF" w:val="clear"/>
+            <w:tcMar>
+              <w:top w:type="dxa" w:w="60"/>
+              <w:left w:type="dxa" w:w="100"/>
+              <w:bottom w:type="dxa" w:w="60"/>
+              <w:right w:type="dxa" w:w="100"/>
+            </w:tcMar>
+          </w:tcPr>
+          <w:p>
+            <w:r>
+              <w:rPr>
+                <w:sz w:val="19"/>
+                <w:szCs w:val="19"/>
+              </w:rPr>
+              <w:t xml:space="preserve">Todos os detalháveis ou só os ativos (sem Data Fim).</w:t>
+            </w:r>
+          </w:p>
+        </w:tc>
+        <w:tc>
+          <w:tcPr>
+            <w:tcW w:type="dxa" w:w="1200"/>
+            <w:shd w:fill="FFFFFF" w:val="clear"/>
+            <w:tcMar>
+              <w:top w:type="dxa" w:w="60"/>
+              <w:left w:type="dxa" w:w="100"/>
+              <w:bottom w:type="dxa" w:w="60"/>
+              <w:right w:type="dxa" w:w="100"/>
+            </w:tcMar>
+          </w:tcPr>
+          <w:p>
+            <w:r>
+              <w:rPr>
+                <w:i/>
+                <w:iCs/>
+                <w:color w:val="6B7280"/>
+                <w:sz w:val="19"/>
+                <w:szCs w:val="19"/>
+              </w:rPr>
+              <w:t xml:space="preserve">Todos</w:t>
+            </w:r>
+          </w:p>
+        </w:tc>
+      </w:tr>
+      <w:tr>
+        <w:tc>
+          <w:tcPr>
+            <w:tcW w:type="dxa" w:w="2600"/>
+            <w:shd w:fill="F2F4F7" w:val="clear"/>
+            <w:tcMar>
+              <w:top w:type="dxa" w:w="60"/>
+              <w:left w:type="dxa" w:w="100"/>
+              <w:bottom w:type="dxa" w:w="60"/>
+              <w:right w:type="dxa" w:w="100"/>
+            </w:tcMar>
+          </w:tcPr>
+          <w:p>
+            <w:r>
+              <w:rPr>
+                <w:b/>
+                <w:bCs/>
+                <w:sz w:val="19"/>
+                <w:szCs w:val="19"/>
+              </w:rPr>
+              <w:t xml:space="preserve">Esconder inativos</w:t>
+            </w:r>
+          </w:p>
+        </w:tc>
+        <w:tc>
+          <w:tcPr>
+            <w:tcW w:type="dxa" w:w="5560"/>
+            <w:shd w:fill="F2F4F7" w:val="clear"/>
+            <w:tcMar>
+              <w:top w:type="dxa" w:w="60"/>
+              <w:left w:type="dxa" w:w="100"/>
+              <w:bottom w:type="dxa" w:w="60"/>
+              <w:right w:type="dxa" w:w="100"/>
+            </w:tcMar>
+          </w:tcPr>
+          <w:p>
+            <w:r>
+              <w:rPr>
+                <w:sz w:val="19"/>
+                <w:szCs w:val="19"/>
+              </w:rPr>
+              <w:t xml:space="preserve">Só muda a exibição na tela, não a marcação.</w:t>
+            </w:r>
+          </w:p>
+        </w:tc>
+        <w:tc>
+          <w:tcPr>
+            <w:tcW w:type="dxa" w:w="1200"/>
+            <w:shd w:fill="F2F4F7" w:val="clear"/>
+            <w:tcMar>
+              <w:top w:type="dxa" w:w="60"/>
+              <w:left w:type="dxa" w:w="100"/>
+              <w:bottom w:type="dxa" w:w="60"/>
+              <w:right w:type="dxa" w:w="100"/>
+            </w:tcMar>
+          </w:tcPr>
+          <w:p>
+            <w:r>
+              <w:rPr>
+                <w:i/>
+                <w:iCs/>
+                <w:color w:val="6B7280"/>
+                <w:sz w:val="19"/>
+                <w:szCs w:val="19"/>
+              </w:rPr>
+              <w:t xml:space="preserve">Não</w:t>
+            </w:r>
+          </w:p>
+        </w:tc>
+      </w:tr>
+      <w:tr>
+        <w:tc>
+          <w:tcPr>
+            <w:tcW w:type="dxa" w:w="2600"/>
+            <w:shd w:fill="FFFFFF" w:val="clear"/>
+            <w:tcMar>
+              <w:top w:type="dxa" w:w="60"/>
+              <w:left w:type="dxa" w:w="100"/>
+              <w:bottom w:type="dxa" w:w="60"/>
+              <w:right w:type="dxa" w:w="100"/>
+            </w:tcMar>
+          </w:tcPr>
+          <w:p>
+            <w:r>
+              <w:rPr>
+                <w:b/>
+                <w:bCs/>
+                <w:sz w:val="19"/>
+                <w:szCs w:val="19"/>
+              </w:rPr>
+              <w:t xml:space="preserve">Chip "CCS - aguardar resposta"</w:t>
+            </w:r>
+          </w:p>
+        </w:tc>
+        <w:tc>
+          <w:tcPr>
+            <w:tcW w:type="dxa" w:w="5560"/>
+            <w:shd w:fill="FFFFFF" w:val="clear"/>
+            <w:tcMar>
+              <w:top w:type="dxa" w:w="60"/>
+              <w:left w:type="dxa" w:w="100"/>
+              <w:bottom w:type="dxa" w:w="60"/>
+              <w:right w:type="dxa" w:w="100"/>
+            </w:tcMar>
+          </w:tcPr>
+          <w:p>
+            <w:r>
+              <w:rPr>
+                <w:sz w:val="19"/>
+                <w:szCs w:val="19"/>
+              </w:rPr>
+              <w:t xml:space="preserve">Aplica o chip no processo depois que o detalhamento é enviado. A etiqueta precisa existir na vara.</w:t>
+            </w:r>
+          </w:p>
+        </w:tc>
+        <w:tc>
+          <w:tcPr>
+            <w:tcW w:type="dxa" w:w="1200"/>
+            <w:shd w:fill="FFFFFF" w:val="clear"/>
+            <w:tcMar>
+              <w:top w:type="dxa" w:w="60"/>
+              <w:left w:type="dxa" w:w="100"/>
+              <w:bottom w:type="dxa" w:w="60"/>
+              <w:right w:type="dxa" w:w="100"/>
+            </w:tcMar>
+          </w:tcPr>
+          <w:p>
+            <w:r>
+              <w:rPr>
+                <w:i/>
+                <w:iCs/>
+                <w:color w:val="6B7280"/>
+                <w:sz w:val="19"/>
+                <w:szCs w:val="19"/>
+              </w:rPr>
+              <w:t xml:space="preserve">Ligado</w:t>
+            </w:r>
+          </w:p>
+        </w:tc>
+      </w:tr>
+      <w:tr>
+        <w:tc>
+          <w:tcPr>
+            <w:tcW w:type="dxa" w:w="2600"/>
+            <w:shd w:fill="F2F4F7" w:val="clear"/>
+            <w:tcMar>
+              <w:top w:type="dxa" w:w="60"/>
+              <w:left w:type="dxa" w:w="100"/>
+              <w:bottom w:type="dxa" w:w="60"/>
+              <w:right w:type="dxa" w:w="100"/>
+            </w:tcMar>
+          </w:tcPr>
+          <w:p>
+            <w:r>
+              <w:rPr>
+                <w:b/>
+                <w:bCs/>
+                <w:sz w:val="19"/>
+                <w:szCs w:val="19"/>
+              </w:rPr>
+              <w:t xml:space="preserve">Motivo da consulta</w:t>
+            </w:r>
+          </w:p>
+        </w:tc>
+        <w:tc>
+          <w:tcPr>
+            <w:tcW w:type="dxa" w:w="5560"/>
+            <w:shd w:fill="F2F4F7" w:val="clear"/>
+            <w:tcMar>
+              <w:top w:type="dxa" w:w="60"/>
+              <w:left w:type="dxa" w:w="100"/>
+              <w:bottom w:type="dxa" w:w="60"/>
+              <w:right w:type="dxa" w:w="100"/>
+            </w:tcMar>
+          </w:tcPr>
+          <w:p>
+            <w:r>
+              <w:rPr>
+                <w:sz w:val="19"/>
+                <w:szCs w:val="19"/>
+              </w:rPr>
+              <w:t xml:space="preserve">Texto do motivo (o número do processo já vai no campo próprio).</w:t>
+            </w:r>
+          </w:p>
+        </w:tc>
+        <w:tc>
+          <w:tcPr>
+            <w:tcW w:type="dxa" w:w="1200"/>
+            <w:shd w:fill="F2F4F7" w:val="clear"/>
+            <w:tcMar>
+              <w:top w:type="dxa" w:w="60"/>
+              <w:left w:type="dxa" w:w="100"/>
+              <w:bottom w:type="dxa" w:w="60"/>
+              <w:right w:type="dxa" w:w="100"/>
+            </w:tcMar>
+          </w:tcPr>
+          <w:p>
+            <w:r>
+              <w:rPr>
+                <w:i/>
+                <w:iCs/>
+                <w:color w:val="6B7280"/>
+                <w:sz w:val="19"/>
+                <w:szCs w:val="19"/>
+              </w:rPr>
+              <w:t xml:space="preserve">Execução trabalhista</w:t>
+            </w:r>
+          </w:p>
+        </w:tc>
+      </w:tr>
+      <w:tr>
+        <w:tc>
+          <w:tcPr>
+            <w:tcW w:type="dxa" w:w="2600"/>
+            <w:shd w:fill="FFFFFF" w:val="clear"/>
+            <w:tcMar>
+              <w:top w:type="dxa" w:w="60"/>
+              <w:left w:type="dxa" w:w="100"/>
+              <w:bottom w:type="dxa" w:w="60"/>
+              <w:right w:type="dxa" w:w="100"/>
+            </w:tcMar>
+          </w:tcPr>
+          <w:p>
+            <w:r>
+              <w:rPr>
+                <w:b/>
+                <w:bCs/>
+                <w:sz w:val="19"/>
+                <w:szCs w:val="19"/>
+              </w:rPr>
+              <w:t xml:space="preserve">Pasta de download</w:t>
+            </w:r>
+          </w:p>
+        </w:tc>
+        <w:tc>
+          <w:tcPr>
+            <w:tcW w:type="dxa" w:w="5560"/>
+            <w:shd w:fill="FFFFFF" w:val="clear"/>
+            <w:tcMar>
+              <w:top w:type="dxa" w:w="60"/>
+              <w:left w:type="dxa" w:w="100"/>
+              <w:bottom w:type="dxa" w:w="60"/>
+              <w:right w:type="dxa" w:w="100"/>
+            </w:tcMar>
+          </w:tcPr>
+          <w:p>
+            <w:r>
+              <w:rPr>
+                <w:sz w:val="19"/>
+                <w:szCs w:val="19"/>
+              </w:rPr>
+              <w:t xml:space="preserve">Subpasta onde os arquivos são salvos.</w:t>
+            </w:r>
+          </w:p>
+        </w:tc>
+        <w:tc>
+          <w:tcPr>
+            <w:tcW w:type="dxa" w:w="1200"/>
+            <w:shd w:fill="FFFFFF" w:val="clear"/>
+            <w:tcMar>
+              <w:top w:type="dxa" w:w="60"/>
+              <w:left w:type="dxa" w:w="100"/>
+              <w:bottom w:type="dxa" w:w="60"/>
+              <w:right w:type="dxa" w:w="100"/>
+            </w:tcMar>
+          </w:tcPr>
+          <w:p>
+            <w:r>
+              <w:rPr>
+                <w:i/>
+                <w:iCs/>
+                <w:color w:val="6B7280"/>
+                <w:sz w:val="19"/>
+                <w:szCs w:val="19"/>
+              </w:rPr>
+              <w:t xml:space="preserve">CRATOS</w:t>
+            </w:r>
+          </w:p>
+        </w:tc>
+      </w:tr>
+    </w:tbl>
+    <w:tbl>
+      <w:tblPr>
+        <w:tblW w:type="dxa" w:w="9360"/>
+        <w:tblBorders>
+          <w:top w:val="single" w:color="CBD5E1" w:sz="2"/>
+          <w:left w:val="single" w:color="1F3A5F" w:sz="12"/>
+          <w:bottom w:val="single" w:color="CBD5E1" w:sz="2"/>
+          <w:right w:val="single" w:color="CBD5E1" w:sz="2"/>
+          <w:insideH w:val="none"/>
+          <w:insideV w:val="none"/>
+        </w:tblBorders>
+      </w:tblPr>
+      <w:tblGrid>
+        <w:gridCol w:w="9360"/>
+      </w:tblGrid>
+      <w:tr>
+        <w:tc>
+          <w:tcPr>
+            <w:tcW w:type="dxa" w:w="9360"/>
+            <w:shd w:fill="F2F4F7" w:val="clear"/>
+            <w:tcMar>
+              <w:top w:type="dxa" w:w="120"/>
+              <w:left w:type="dxa" w:w="160"/>
+              <w:bottom w:type="dxa" w:w="120"/>
+              <w:right w:type="dxa" w:w="160"/>
+            </w:tcMar>
+          </w:tcPr>
+          <w:p>
+            <w:pPr>
+              <w:spacing w:after="60"/>
+            </w:pPr>
+            <w:r>
+              <w:rPr>
+                <w:b/>
+                <w:bCs/>
+                <w:color w:val="1F3A5F"/>
+              </w:rPr>
+              <w:t xml:space="preserve">Observações do CCS</w:t>
+            </w:r>
+          </w:p>
+          <w:p>
+            <w:pPr>
+              <w:spacing w:after="40" w:line="264"/>
+            </w:pPr>
+            <w:r>
+              <w:t xml:space="preserve">O login é seu (ADFS do Banco Central). Uma requisição por processo, com todos os executados.</w:t>
+            </w:r>
+          </w:p>
+          <w:p>
+            <w:pPr>
+              <w:spacing w:after="40" w:line="264"/>
+            </w:pPr>
+            <w:r>
+              <w:t xml:space="preserve">No dia seguinte, use "Coletar CCS" no painel (veja 5.7). Só o PDF do próprio CCS é juntado, e os anexos entram sigilosos.</w:t>
+            </w:r>
+          </w:p>
+        </w:tc>
+      </w:tr>
+    </w:tbl>
+    <w:p>
+      <w:pPr>
+        <w:pStyle w:val="Heading2"/>
+        <w:spacing w:after="100" w:before="240"/>
+      </w:pPr>
+      <w:r>
+        <w:t xml:space="preserve">6.8. SNIPER (investigação patrimonial)</w:t>
+      </w:r>
+    </w:p>
+    <w:tbl>
+      <w:tblPr>
+        <w:tblW w:type="dxa" w:w="9360"/>
+        <w:tblBorders>
+          <w:top w:val="single" w:color="auto" w:sz="4"/>
+          <w:left w:val="single" w:color="auto" w:sz="4"/>
+          <w:bottom w:val="single" w:color="auto" w:sz="4"/>
+          <w:right w:val="single" w:color="auto" w:sz="4"/>
+          <w:insideH w:val="single" w:color="auto" w:sz="4"/>
+          <w:insideV w:val="single" w:color="auto" w:sz="4"/>
+        </w:tblBorders>
+      </w:tblPr>
+      <w:tblGrid>
+        <w:gridCol w:w="2600"/>
+        <w:gridCol w:w="5560"/>
+        <w:gridCol w:w="1200"/>
+      </w:tblGrid>
+      <w:tr>
+        <w:trPr>
+          <w:tblHeader/>
+        </w:trPr>
+        <w:tc>
+          <w:tcPr>
+            <w:tcW w:type="dxa" w:w="0"/>
+            <w:shd w:fill="1F3A5F" w:val="clear"/>
+            <w:tcMar>
+              <w:top w:type="dxa" w:w="60"/>
+              <w:left w:type="dxa" w:w="100"/>
+              <w:bottom w:type="dxa" w:w="60"/>
+              <w:right w:type="dxa" w:w="100"/>
+            </w:tcMar>
+          </w:tcPr>
+          <w:p>
+            <w:r>
+              <w:rPr>
+                <w:b/>
+                <w:bCs/>
+                <w:color w:val="FFFFFF"/>
+                <w:sz w:val="19"/>
+                <w:szCs w:val="19"/>
+              </w:rPr>
+              <w:t xml:space="preserve">Opção</w:t>
+            </w:r>
+          </w:p>
+        </w:tc>
+        <w:tc>
+          <w:tcPr>
+            <w:tcW w:type="dxa" w:w="0"/>
+            <w:shd w:fill="1F3A5F" w:val="clear"/>
+            <w:tcMar>
+              <w:top w:type="dxa" w:w="60"/>
+              <w:left w:type="dxa" w:w="100"/>
+              <w:bottom w:type="dxa" w:w="60"/>
+              <w:right w:type="dxa" w:w="100"/>
+            </w:tcMar>
+          </w:tcPr>
+          <w:p>
+            <w:r>
+              <w:rPr>
+                <w:b/>
+                <w:bCs/>
+                <w:color w:val="FFFFFF"/>
+                <w:sz w:val="19"/>
+                <w:szCs w:val="19"/>
+              </w:rPr>
+              <w:t xml:space="preserve">O que faz</w:t>
+            </w:r>
+          </w:p>
+        </w:tc>
+        <w:tc>
+          <w:tcPr>
+            <w:tcW w:type="dxa" w:w="0"/>
+            <w:shd w:fill="1F3A5F" w:val="clear"/>
+            <w:tcMar>
+              <w:top w:type="dxa" w:w="60"/>
+              <w:left w:type="dxa" w:w="100"/>
+              <w:bottom w:type="dxa" w:w="60"/>
+              <w:right w:type="dxa" w:w="100"/>
+            </w:tcMar>
+          </w:tcPr>
+          <w:p>
+            <w:r>
+              <w:rPr>
+                <w:b/>
+                <w:bCs/>
+                <w:color w:val="FFFFFF"/>
+                <w:sz w:val="19"/>
+                <w:szCs w:val="19"/>
+              </w:rPr>
+              <w:t xml:space="preserve">Padrão</w:t>
+            </w:r>
+          </w:p>
+        </w:tc>
+      </w:tr>
+      <w:tr>
+        <w:tc>
+          <w:tcPr>
+            <w:tcW w:type="dxa" w:w="2600"/>
+            <w:shd w:fill="FFFFFF" w:val="clear"/>
+            <w:tcMar>
+              <w:top w:type="dxa" w:w="60"/>
+              <w:left w:type="dxa" w:w="100"/>
+              <w:bottom w:type="dxa" w:w="60"/>
+              <w:right w:type="dxa" w:w="100"/>
+            </w:tcMar>
+          </w:tcPr>
+          <w:p>
+            <w:r>
+              <w:rPr>
+                <w:b/>
+                <w:bCs/>
+                <w:sz w:val="19"/>
+                <w:szCs w:val="19"/>
+              </w:rPr>
+              <w:t xml:space="preserve">Fontes</w:t>
+            </w:r>
+          </w:p>
+        </w:tc>
+        <w:tc>
+          <w:tcPr>
+            <w:tcW w:type="dxa" w:w="5560"/>
+            <w:shd w:fill="FFFFFF" w:val="clear"/>
+            <w:tcMar>
+              <w:top w:type="dxa" w:w="60"/>
+              <w:left w:type="dxa" w:w="100"/>
+              <w:bottom w:type="dxa" w:w="60"/>
+              <w:right w:type="dxa" w:w="100"/>
+            </w:tcMar>
+          </w:tcPr>
+          <w:p>
+            <w:r>
+              <w:rPr>
+                <w:sz w:val="19"/>
+                <w:szCs w:val="19"/>
+              </w:rPr>
+              <w:t xml:space="preserve">Sisbajud (contas), Renajud (veículos), SERP/ONR (imóveis), AnacJud (aeronaves), Tribunal Marítimo (embarcações), TSE (bens declarados), SNGB (bens apreendidos) e CGU (sanções). Marque as que quer consultar.</w:t>
+            </w:r>
+          </w:p>
+        </w:tc>
+        <w:tc>
+          <w:tcPr>
+            <w:tcW w:type="dxa" w:w="1200"/>
+            <w:shd w:fill="FFFFFF" w:val="clear"/>
+            <w:tcMar>
+              <w:top w:type="dxa" w:w="60"/>
+              <w:left w:type="dxa" w:w="100"/>
+              <w:bottom w:type="dxa" w:w="60"/>
+              <w:right w:type="dxa" w:w="100"/>
+            </w:tcMar>
+          </w:tcPr>
+          <w:p>
+            <w:r>
+              <w:rPr>
+                <w:i/>
+                <w:iCs/>
+                <w:color w:val="6B7280"/>
+                <w:sz w:val="19"/>
+                <w:szCs w:val="19"/>
+              </w:rPr>
+              <w:t xml:space="preserve">Todas</w:t>
+            </w:r>
+          </w:p>
+        </w:tc>
+      </w:tr>
+      <w:tr>
+        <w:tc>
+          <w:tcPr>
+            <w:tcW w:type="dxa" w:w="2600"/>
+            <w:shd w:fill="F2F4F7" w:val="clear"/>
+            <w:tcMar>
+              <w:top w:type="dxa" w:w="60"/>
+              <w:left w:type="dxa" w:w="100"/>
+              <w:bottom w:type="dxa" w:w="60"/>
+              <w:right w:type="dxa" w:w="100"/>
+            </w:tcMar>
+          </w:tcPr>
+          <w:p>
+            <w:r>
+              <w:rPr>
+                <w:b/>
+                <w:bCs/>
+                <w:sz w:val="19"/>
+                <w:szCs w:val="19"/>
+              </w:rPr>
+              <w:t xml:space="preserve">Pasta de download</w:t>
+            </w:r>
+          </w:p>
+        </w:tc>
+        <w:tc>
+          <w:tcPr>
+            <w:tcW w:type="dxa" w:w="5560"/>
+            <w:shd w:fill="F2F4F7" w:val="clear"/>
+            <w:tcMar>
+              <w:top w:type="dxa" w:w="60"/>
+              <w:left w:type="dxa" w:w="100"/>
+              <w:bottom w:type="dxa" w:w="60"/>
+              <w:right w:type="dxa" w:w="100"/>
+            </w:tcMar>
+          </w:tcPr>
+          <w:p>
+            <w:r>
+              <w:rPr>
+                <w:sz w:val="19"/>
+                <w:szCs w:val="19"/>
+              </w:rPr>
+              <w:t xml:space="preserve">Subpasta onde os arquivos são salvos.</w:t>
+            </w:r>
+          </w:p>
+        </w:tc>
+        <w:tc>
+          <w:tcPr>
+            <w:tcW w:type="dxa" w:w="1200"/>
+            <w:shd w:fill="F2F4F7" w:val="clear"/>
+            <w:tcMar>
+              <w:top w:type="dxa" w:w="60"/>
+              <w:left w:type="dxa" w:w="100"/>
+              <w:bottom w:type="dxa" w:w="60"/>
+              <w:right w:type="dxa" w:w="100"/>
+            </w:tcMar>
+          </w:tcPr>
+          <w:p>
+            <w:r>
+              <w:rPr>
+                <w:i/>
+                <w:iCs/>
+                <w:color w:val="6B7280"/>
+                <w:sz w:val="19"/>
+                <w:szCs w:val="19"/>
+              </w:rPr>
+              <w:t xml:space="preserve">CRATOS</w:t>
+            </w:r>
+          </w:p>
+        </w:tc>
+      </w:tr>
+    </w:tbl>
+    <w:tbl>
+      <w:tblPr>
+        <w:tblW w:type="dxa" w:w="9360"/>
+        <w:tblBorders>
+          <w:top w:val="single" w:color="CBD5E1" w:sz="2"/>
+          <w:left w:val="single" w:color="1F3A5F" w:sz="12"/>
+          <w:bottom w:val="single" w:color="CBD5E1" w:sz="2"/>
+          <w:right w:val="single" w:color="CBD5E1" w:sz="2"/>
+          <w:insideH w:val="none"/>
+          <w:insideV w:val="none"/>
+        </w:tblBorders>
+      </w:tblPr>
+      <w:tblGrid>
+        <w:gridCol w:w="9360"/>
+      </w:tblGrid>
+      <w:tr>
+        <w:tc>
+          <w:tcPr>
+            <w:tcW w:type="dxa" w:w="9360"/>
+            <w:shd w:fill="F2F4F7" w:val="clear"/>
+            <w:tcMar>
+              <w:top w:type="dxa" w:w="120"/>
+              <w:left w:type="dxa" w:w="160"/>
+              <w:bottom w:type="dxa" w:w="120"/>
+              <w:right w:type="dxa" w:w="160"/>
+            </w:tcMar>
+          </w:tcPr>
+          <w:p>
+            <w:pPr>
+              <w:spacing w:after="60"/>
+            </w:pPr>
+            <w:r>
+              <w:rPr>
+                <w:b/>
+                <w:bCs/>
+                <w:color w:val="1F3A5F"/>
+              </w:rPr>
+              <w:t xml:space="preserve">Observações do SNIPER</w:t>
+            </w:r>
+          </w:p>
+          <w:p>
+            <w:pPr>
+              <w:spacing w:after="40" w:line="264"/>
+            </w:pPr>
+            <w:r>
+              <w:t xml:space="preserve">O login é seu (PDPJ). O CRATOS só faz investigação: nunca clica em bloqueio, restrição ou outra constrição.</w:t>
+            </w:r>
+          </w:p>
+          <w:p>
+            <w:pPr>
+              <w:spacing w:after="40" w:line="264"/>
+            </w:pPr>
+            <w:r>
+              <w:t xml:space="preserve">Saem o relatório (com o cadastro da Receita e os processos de cada parte) e a certidão, fonte por fonte. Erro de uma fonte nunca vira "nada encontrado". Os anexos entram sigilosos.</w:t>
+            </w:r>
+          </w:p>
+        </w:tc>
+      </w:tr>
+    </w:tbl>
+    <w:p>
+      <w:pPr>
+        <w:pStyle w:val="Heading2"/>
+        <w:spacing w:after="100" w:before="240"/>
+      </w:pPr>
+      <w:r>
+        <w:t xml:space="preserve">6.9. PREVJUD (Dossiê Previdenciário)</w:t>
+      </w:r>
+    </w:p>
+    <w:tbl>
+      <w:tblPr>
+        <w:tblW w:type="dxa" w:w="9360"/>
+        <w:tblBorders>
+          <w:top w:val="single" w:color="auto" w:sz="4"/>
+          <w:left w:val="single" w:color="auto" w:sz="4"/>
+          <w:bottom w:val="single" w:color="auto" w:sz="4"/>
+          <w:right w:val="single" w:color="auto" w:sz="4"/>
+          <w:insideH w:val="single" w:color="auto" w:sz="4"/>
+          <w:insideV w:val="single" w:color="auto" w:sz="4"/>
+        </w:tblBorders>
+      </w:tblPr>
+      <w:tblGrid>
+        <w:gridCol w:w="2600"/>
+        <w:gridCol w:w="5560"/>
+        <w:gridCol w:w="1200"/>
+      </w:tblGrid>
+      <w:tr>
+        <w:trPr>
+          <w:tblHeader/>
+        </w:trPr>
+        <w:tc>
+          <w:tcPr>
+            <w:tcW w:type="dxa" w:w="0"/>
+            <w:shd w:fill="1F3A5F" w:val="clear"/>
+            <w:tcMar>
+              <w:top w:type="dxa" w:w="60"/>
+              <w:left w:type="dxa" w:w="100"/>
+              <w:bottom w:type="dxa" w:w="60"/>
+              <w:right w:type="dxa" w:w="100"/>
+            </w:tcMar>
+          </w:tcPr>
+          <w:p>
+            <w:r>
+              <w:rPr>
+                <w:b/>
+                <w:bCs/>
+                <w:color w:val="FFFFFF"/>
+                <w:sz w:val="19"/>
+                <w:szCs w:val="19"/>
+              </w:rPr>
+              <w:t xml:space="preserve">Opção</w:t>
+            </w:r>
+          </w:p>
+        </w:tc>
+        <w:tc>
+          <w:tcPr>
+            <w:tcW w:type="dxa" w:w="0"/>
+            <w:shd w:fill="1F3A5F" w:val="clear"/>
+            <w:tcMar>
+              <w:top w:type="dxa" w:w="60"/>
+              <w:left w:type="dxa" w:w="100"/>
+              <w:bottom w:type="dxa" w:w="60"/>
+              <w:right w:type="dxa" w:w="100"/>
+            </w:tcMar>
+          </w:tcPr>
+          <w:p>
+            <w:r>
+              <w:rPr>
+                <w:b/>
+                <w:bCs/>
+                <w:color w:val="FFFFFF"/>
+                <w:sz w:val="19"/>
+                <w:szCs w:val="19"/>
+              </w:rPr>
+              <w:t xml:space="preserve">O que faz</w:t>
+            </w:r>
+          </w:p>
+        </w:tc>
+        <w:tc>
+          <w:tcPr>
+            <w:tcW w:type="dxa" w:w="0"/>
+            <w:shd w:fill="1F3A5F" w:val="clear"/>
+            <w:tcMar>
+              <w:top w:type="dxa" w:w="60"/>
+              <w:left w:type="dxa" w:w="100"/>
+              <w:bottom w:type="dxa" w:w="60"/>
+              <w:right w:type="dxa" w:w="100"/>
+            </w:tcMar>
+          </w:tcPr>
+          <w:p>
+            <w:r>
+              <w:rPr>
+                <w:b/>
+                <w:bCs/>
+                <w:color w:val="FFFFFF"/>
+                <w:sz w:val="19"/>
+                <w:szCs w:val="19"/>
+              </w:rPr>
+              <w:t xml:space="preserve">Padrão</w:t>
+            </w:r>
+          </w:p>
+        </w:tc>
+      </w:tr>
+      <w:tr>
+        <w:tc>
+          <w:tcPr>
+            <w:tcW w:type="dxa" w:w="2600"/>
+            <w:shd w:fill="FFFFFF" w:val="clear"/>
+            <w:tcMar>
+              <w:top w:type="dxa" w:w="60"/>
+              <w:left w:type="dxa" w:w="100"/>
+              <w:bottom w:type="dxa" w:w="60"/>
+              <w:right w:type="dxa" w:w="100"/>
+            </w:tcMar>
+          </w:tcPr>
+          <w:p>
+            <w:r>
+              <w:rPr>
+                <w:b/>
+                <w:bCs/>
+                <w:sz w:val="19"/>
+                <w:szCs w:val="19"/>
+              </w:rPr>
+              <w:t xml:space="preserve">Documentos a juntar</w:t>
+            </w:r>
+          </w:p>
+        </w:tc>
+        <w:tc>
+          <w:tcPr>
+            <w:tcW w:type="dxa" w:w="5560"/>
+            <w:shd w:fill="FFFFFF" w:val="clear"/>
+            <w:tcMar>
+              <w:top w:type="dxa" w:w="60"/>
+              <w:left w:type="dxa" w:w="100"/>
+              <w:bottom w:type="dxa" w:w="60"/>
+              <w:right w:type="dxa" w:w="100"/>
+            </w:tcMar>
+          </w:tcPr>
+          <w:p>
+            <w:r>
+              <w:rPr>
+                <w:sz w:val="19"/>
+                <w:szCs w:val="19"/>
+              </w:rPr>
+              <w:t xml:space="preserve">Declaração de Benefícios, Carta de Concessão, Dados Cadastrais, Quadro Resumo, Extrato CNIS, Histórico de Créditos e outros que o PREVJUD passar a oferecer. Ligue ou desligue cada um.</w:t>
+            </w:r>
+          </w:p>
+        </w:tc>
+        <w:tc>
+          <w:tcPr>
+            <w:tcW w:type="dxa" w:w="1200"/>
+            <w:shd w:fill="FFFFFF" w:val="clear"/>
+            <w:tcMar>
+              <w:top w:type="dxa" w:w="60"/>
+              <w:left w:type="dxa" w:w="100"/>
+              <w:bottom w:type="dxa" w:w="60"/>
+              <w:right w:type="dxa" w:w="100"/>
+            </w:tcMar>
+          </w:tcPr>
+          <w:p>
+            <w:r>
+              <w:rPr>
+                <w:i/>
+                <w:iCs/>
+                <w:color w:val="6B7280"/>
+                <w:sz w:val="19"/>
+                <w:szCs w:val="19"/>
+              </w:rPr>
+              <w:t xml:space="preserve">Todos</w:t>
+            </w:r>
+          </w:p>
+        </w:tc>
+      </w:tr>
+      <w:tr>
+        <w:tc>
+          <w:tcPr>
+            <w:tcW w:type="dxa" w:w="2600"/>
+            <w:shd w:fill="F2F4F7" w:val="clear"/>
+            <w:tcMar>
+              <w:top w:type="dxa" w:w="60"/>
+              <w:left w:type="dxa" w:w="100"/>
+              <w:bottom w:type="dxa" w:w="60"/>
+              <w:right w:type="dxa" w:w="100"/>
+            </w:tcMar>
+          </w:tcPr>
+          <w:p>
+            <w:r>
+              <w:rPr>
+                <w:b/>
+                <w:bCs/>
+                <w:sz w:val="19"/>
+                <w:szCs w:val="19"/>
+              </w:rPr>
+              <w:t xml:space="preserve">Pasta de download</w:t>
+            </w:r>
+          </w:p>
+        </w:tc>
+        <w:tc>
+          <w:tcPr>
+            <w:tcW w:type="dxa" w:w="5560"/>
+            <w:shd w:fill="F2F4F7" w:val="clear"/>
+            <w:tcMar>
+              <w:top w:type="dxa" w:w="60"/>
+              <w:left w:type="dxa" w:w="100"/>
+              <w:bottom w:type="dxa" w:w="60"/>
+              <w:right w:type="dxa" w:w="100"/>
+            </w:tcMar>
+          </w:tcPr>
+          <w:p>
+            <w:r>
+              <w:rPr>
+                <w:sz w:val="19"/>
+                <w:szCs w:val="19"/>
+              </w:rPr>
+              <w:t xml:space="preserve">Subpasta onde os arquivos são salvos.</w:t>
+            </w:r>
+          </w:p>
+        </w:tc>
+        <w:tc>
+          <w:tcPr>
+            <w:tcW w:type="dxa" w:w="1200"/>
+            <w:shd w:fill="F2F4F7" w:val="clear"/>
+            <w:tcMar>
+              <w:top w:type="dxa" w:w="60"/>
+              <w:left w:type="dxa" w:w="100"/>
+              <w:bottom w:type="dxa" w:w="60"/>
+              <w:right w:type="dxa" w:w="100"/>
+            </w:tcMar>
+          </w:tcPr>
+          <w:p>
+            <w:r>
+              <w:rPr>
+                <w:i/>
+                <w:iCs/>
+                <w:color w:val="6B7280"/>
+                <w:sz w:val="19"/>
+                <w:szCs w:val="19"/>
+              </w:rPr>
+              <w:t xml:space="preserve">CRATOS</w:t>
+            </w:r>
+          </w:p>
+        </w:tc>
+      </w:tr>
+    </w:tbl>
+    <w:tbl>
+      <w:tblPr>
+        <w:tblW w:type="dxa" w:w="9360"/>
+        <w:tblBorders>
+          <w:top w:val="single" w:color="CBD5E1" w:sz="2"/>
+          <w:left w:val="single" w:color="1F3A5F" w:sz="12"/>
+          <w:bottom w:val="single" w:color="CBD5E1" w:sz="2"/>
+          <w:right w:val="single" w:color="CBD5E1" w:sz="2"/>
+          <w:insideH w:val="none"/>
+          <w:insideV w:val="none"/>
+        </w:tblBorders>
+      </w:tblPr>
+      <w:tblGrid>
+        <w:gridCol w:w="9360"/>
+      </w:tblGrid>
+      <w:tr>
+        <w:tc>
+          <w:tcPr>
+            <w:tcW w:type="dxa" w:w="9360"/>
+            <w:shd w:fill="F2F4F7" w:val="clear"/>
+            <w:tcMar>
+              <w:top w:type="dxa" w:w="120"/>
+              <w:left w:type="dxa" w:w="160"/>
+              <w:bottom w:type="dxa" w:w="120"/>
+              <w:right w:type="dxa" w:w="160"/>
+            </w:tcMar>
+          </w:tcPr>
+          <w:p>
+            <w:pPr>
+              <w:spacing w:after="60"/>
+            </w:pPr>
+            <w:r>
+              <w:rPr>
+                <w:b/>
+                <w:bCs/>
+                <w:color w:val="1F3A5F"/>
+              </w:rPr>
+              <w:t xml:space="preserve">Observações do PREVJUD</w:t>
+            </w:r>
+          </w:p>
+          <w:p>
+            <w:pPr>
+              <w:spacing w:after="40" w:line="264"/>
+            </w:pPr>
+            <w:r>
+              <w:t xml:space="preserve">O login é seu (jus.br). Só o Dossiê Previdenciário, para executados pessoa física; o CRATOS nunca abre o Dossiê Médico.</w:t>
+            </w:r>
+          </w:p>
+          <w:p>
+            <w:pPr>
+              <w:spacing w:after="40" w:line="264"/>
+            </w:pPr>
+            <w:r>
+              <w:t xml:space="preserve">O CRATOS espera até 15 minutos. O que não ficar pronto vai na certidão como "em processamento" e é buscado depois por "Coletar PREVJUD" (veja 5.7). Os anexos entram sigilosos.</w:t>
+            </w:r>
+          </w:p>
+        </w:tc>
+      </w:tr>
+    </w:tbl>
+    <w:p>
+      <w:pPr>
+        <w:pStyle w:val="Heading2"/>
+        <w:spacing w:after="100" w:before="240"/>
+      </w:pPr>
+      <w:r>
+        <w:t xml:space="preserve">6.10. Juntada da certidão</w:t>
+      </w:r>
+    </w:p>
+    <w:tbl>
+      <w:tblPr>
+        <w:tblW w:type="dxa" w:w="9360"/>
+        <w:tblBorders>
+          <w:top w:val="single" w:color="auto" w:sz="4"/>
+          <w:left w:val="single" w:color="auto" w:sz="4"/>
+          <w:bottom w:val="single" w:color="auto" w:sz="4"/>
+          <w:right w:val="single" w:color="auto" w:sz="4"/>
+          <w:insideH w:val="single" w:color="auto" w:sz="4"/>
+          <w:insideV w:val="single" w:color="auto" w:sz="4"/>
+        </w:tblBorders>
+      </w:tblPr>
+      <w:tblGrid>
+        <w:gridCol w:w="2600"/>
+        <w:gridCol w:w="5560"/>
+        <w:gridCol w:w="1200"/>
+      </w:tblGrid>
+      <w:tr>
+        <w:trPr>
+          <w:tblHeader/>
+        </w:trPr>
+        <w:tc>
+          <w:tcPr>
+            <w:tcW w:type="dxa" w:w="0"/>
+            <w:shd w:fill="1F3A5F" w:val="clear"/>
+            <w:tcMar>
+              <w:top w:type="dxa" w:w="60"/>
+              <w:left w:type="dxa" w:w="100"/>
+              <w:bottom w:type="dxa" w:w="60"/>
+              <w:right w:type="dxa" w:w="100"/>
+            </w:tcMar>
+          </w:tcPr>
+          <w:p>
+            <w:r>
+              <w:rPr>
+                <w:b/>
+                <w:bCs/>
+                <w:color w:val="FFFFFF"/>
+                <w:sz w:val="19"/>
+                <w:szCs w:val="19"/>
+              </w:rPr>
+              <w:t xml:space="preserve">Opção</w:t>
+            </w:r>
+          </w:p>
+        </w:tc>
+        <w:tc>
+          <w:tcPr>
+            <w:tcW w:type="dxa" w:w="0"/>
+            <w:shd w:fill="1F3A5F" w:val="clear"/>
+            <w:tcMar>
+              <w:top w:type="dxa" w:w="60"/>
+              <w:left w:type="dxa" w:w="100"/>
+              <w:bottom w:type="dxa" w:w="60"/>
+              <w:right w:type="dxa" w:w="100"/>
+            </w:tcMar>
+          </w:tcPr>
+          <w:p>
+            <w:r>
+              <w:rPr>
+                <w:b/>
+                <w:bCs/>
+                <w:color w:val="FFFFFF"/>
+                <w:sz w:val="19"/>
+                <w:szCs w:val="19"/>
+              </w:rPr>
+              <w:t xml:space="preserve">O que faz</w:t>
+            </w:r>
+          </w:p>
+        </w:tc>
+        <w:tc>
+          <w:tcPr>
+            <w:tcW w:type="dxa" w:w="0"/>
+            <w:shd w:fill="1F3A5F" w:val="clear"/>
+            <w:tcMar>
+              <w:top w:type="dxa" w:w="60"/>
+              <w:left w:type="dxa" w:w="100"/>
+              <w:bottom w:type="dxa" w:w="60"/>
+              <w:right w:type="dxa" w:w="100"/>
+            </w:tcMar>
+          </w:tcPr>
+          <w:p>
+            <w:r>
+              <w:rPr>
+                <w:b/>
+                <w:bCs/>
+                <w:color w:val="FFFFFF"/>
+                <w:sz w:val="19"/>
+                <w:szCs w:val="19"/>
+              </w:rPr>
+              <w:t xml:space="preserve">Padrão</w:t>
+            </w:r>
+          </w:p>
+        </w:tc>
+      </w:tr>
+      <w:tr>
+        <w:tc>
+          <w:tcPr>
+            <w:tcW w:type="dxa" w:w="2600"/>
+            <w:shd w:fill="FFFFFF" w:val="clear"/>
+            <w:tcMar>
+              <w:top w:type="dxa" w:w="60"/>
+              <w:left w:type="dxa" w:w="100"/>
+              <w:bottom w:type="dxa" w:w="60"/>
+              <w:right w:type="dxa" w:w="100"/>
+            </w:tcMar>
+          </w:tcPr>
+          <w:p>
+            <w:r>
+              <w:rPr>
+                <w:b/>
+                <w:bCs/>
+                <w:sz w:val="19"/>
+                <w:szCs w:val="19"/>
+              </w:rPr>
+              <w:t xml:space="preserve">Ao terminar os convênios</w:t>
+            </w:r>
+          </w:p>
+        </w:tc>
+        <w:tc>
+          <w:tcPr>
+            <w:tcW w:type="dxa" w:w="5560"/>
+            <w:shd w:fill="FFFFFF" w:val="clear"/>
+            <w:tcMar>
+              <w:top w:type="dxa" w:w="60"/>
+              <w:left w:type="dxa" w:w="100"/>
+              <w:bottom w:type="dxa" w:w="60"/>
+              <w:right w:type="dxa" w:w="100"/>
+            </w:tcMar>
+          </w:tcPr>
+          <w:p>
+            <w:r>
+              <w:rPr>
+                <w:sz w:val="19"/>
+                <w:szCs w:val="19"/>
+              </w:rPr>
+              <w:t xml:space="preserve">Criar a minuta da certidão automaticamente, ou deixar para você criar pelo botão do painel.</w:t>
+            </w:r>
+          </w:p>
+        </w:tc>
+        <w:tc>
+          <w:tcPr>
+            <w:tcW w:type="dxa" w:w="1200"/>
+            <w:shd w:fill="FFFFFF" w:val="clear"/>
+            <w:tcMar>
+              <w:top w:type="dxa" w:w="60"/>
+              <w:left w:type="dxa" w:w="100"/>
+              <w:bottom w:type="dxa" w:w="60"/>
+              <w:right w:type="dxa" w:w="100"/>
+            </w:tcMar>
+          </w:tcPr>
+          <w:p>
+            <w:r>
+              <w:rPr>
+                <w:i/>
+                <w:iCs/>
+                <w:color w:val="6B7280"/>
+                <w:sz w:val="19"/>
+                <w:szCs w:val="19"/>
+              </w:rPr>
+              <w:t xml:space="preserve">Criar</w:t>
+            </w:r>
+          </w:p>
+        </w:tc>
+      </w:tr>
+      <w:tr>
+        <w:tc>
+          <w:tcPr>
+            <w:tcW w:type="dxa" w:w="2600"/>
+            <w:shd w:fill="F2F4F7" w:val="clear"/>
+            <w:tcMar>
+              <w:top w:type="dxa" w:w="60"/>
+              <w:left w:type="dxa" w:w="100"/>
+              <w:bottom w:type="dxa" w:w="60"/>
+              <w:right w:type="dxa" w:w="100"/>
+            </w:tcMar>
+          </w:tcPr>
+          <w:p>
+            <w:r>
+              <w:rPr>
+                <w:b/>
+                <w:bCs/>
+                <w:sz w:val="19"/>
+                <w:szCs w:val="19"/>
+              </w:rPr>
+              <w:t xml:space="preserve">Dar visibilidade às partes</w:t>
+            </w:r>
+          </w:p>
+        </w:tc>
+        <w:tc>
+          <w:tcPr>
+            <w:tcW w:type="dxa" w:w="5560"/>
+            <w:shd w:fill="F2F4F7" w:val="clear"/>
+            <w:tcMar>
+              <w:top w:type="dxa" w:w="60"/>
+              <w:left w:type="dxa" w:w="100"/>
+              <w:bottom w:type="dxa" w:w="60"/>
+              <w:right w:type="dxa" w:w="100"/>
+            </w:tcMar>
+          </w:tcPr>
+          <w:p>
+            <w:r>
+              <w:rPr>
+                <w:sz w:val="19"/>
+                <w:szCs w:val="19"/>
+              </w:rPr>
+              <w:t xml:space="preserve">Liberar a certidão para o polo ativo e/ou o polo passivo. Marcando os dois, todas as partes enxergam.</w:t>
+            </w:r>
+          </w:p>
+        </w:tc>
+        <w:tc>
+          <w:tcPr>
+            <w:tcW w:type="dxa" w:w="1200"/>
+            <w:shd w:fill="F2F4F7" w:val="clear"/>
+            <w:tcMar>
+              <w:top w:type="dxa" w:w="60"/>
+              <w:left w:type="dxa" w:w="100"/>
+              <w:bottom w:type="dxa" w:w="60"/>
+              <w:right w:type="dxa" w:w="100"/>
+            </w:tcMar>
+          </w:tcPr>
+          <w:p>
+            <w:r>
+              <w:rPr>
+                <w:i/>
+                <w:iCs/>
+                <w:color w:val="6B7280"/>
+                <w:sz w:val="19"/>
+                <w:szCs w:val="19"/>
+              </w:rPr>
               <w:t xml:space="preserve">Ambos</w:t>
             </w:r>
           </w:p>
         </w:tc>
       </w:tr>
     </w:tbl>
+    <w:p>
+      <w:pPr>
+        <w:pStyle w:val="Heading2"/>
+        <w:spacing w:after="100" w:before="240"/>
+      </w:pPr>
+      <w:r>
+        <w:t xml:space="preserve">6.11. Novidades da versão e Sobre</w:t>
+      </w:r>
+    </w:p>
+    <w:tbl>
+      <w:tblPr>
+        <w:tblW w:type="dxa" w:w="9360"/>
+        <w:tblBorders>
+          <w:top w:val="single" w:color="auto" w:sz="4"/>
+          <w:left w:val="single" w:color="auto" w:sz="4"/>
+          <w:bottom w:val="single" w:color="auto" w:sz="4"/>
+          <w:right w:val="single" w:color="auto" w:sz="4"/>
+          <w:insideH w:val="single" w:color="auto" w:sz="4"/>
+          <w:insideV w:val="single" w:color="auto" w:sz="4"/>
+        </w:tblBorders>
+      </w:tblPr>
+      <w:tblGrid>
+        <w:gridCol w:w="2600"/>
+        <w:gridCol w:w="5560"/>
+        <w:gridCol w:w="1200"/>
+      </w:tblGrid>
+      <w:tr>
+        <w:trPr>
+          <w:tblHeader/>
+        </w:trPr>
+        <w:tc>
+          <w:tcPr>
+            <w:tcW w:type="dxa" w:w="0"/>
+            <w:shd w:fill="1F3A5F" w:val="clear"/>
+            <w:tcMar>
+              <w:top w:type="dxa" w:w="60"/>
+              <w:left w:type="dxa" w:w="100"/>
+              <w:bottom w:type="dxa" w:w="60"/>
+              <w:right w:type="dxa" w:w="100"/>
+            </w:tcMar>
+          </w:tcPr>
+          <w:p>
+            <w:r>
+              <w:rPr>
+                <w:b/>
+                <w:bCs/>
+                <w:color w:val="FFFFFF"/>
+                <w:sz w:val="19"/>
+                <w:szCs w:val="19"/>
+              </w:rPr>
+              <w:t xml:space="preserve">Opção</w:t>
+            </w:r>
+          </w:p>
+        </w:tc>
+        <w:tc>
+          <w:tcPr>
+            <w:tcW w:type="dxa" w:w="0"/>
+            <w:shd w:fill="1F3A5F" w:val="clear"/>
+            <w:tcMar>
+              <w:top w:type="dxa" w:w="60"/>
+              <w:left w:type="dxa" w:w="100"/>
+              <w:bottom w:type="dxa" w:w="60"/>
+              <w:right w:type="dxa" w:w="100"/>
+            </w:tcMar>
+          </w:tcPr>
+          <w:p>
+            <w:r>
+              <w:rPr>
+                <w:b/>
+                <w:bCs/>
+                <w:color w:val="FFFFFF"/>
+                <w:sz w:val="19"/>
+                <w:szCs w:val="19"/>
+              </w:rPr>
+              <w:t xml:space="preserve">O que faz</w:t>
+            </w:r>
+          </w:p>
+        </w:tc>
+        <w:tc>
+          <w:tcPr>
+            <w:tcW w:type="dxa" w:w="0"/>
+            <w:shd w:fill="1F3A5F" w:val="clear"/>
+            <w:tcMar>
+              <w:top w:type="dxa" w:w="60"/>
+              <w:left w:type="dxa" w:w="100"/>
+              <w:bottom w:type="dxa" w:w="60"/>
+              <w:right w:type="dxa" w:w="100"/>
+            </w:tcMar>
+          </w:tcPr>
+          <w:p>
+            <w:r>
+              <w:rPr>
+                <w:b/>
+                <w:bCs/>
+                <w:color w:val="FFFFFF"/>
+                <w:sz w:val="19"/>
+                <w:szCs w:val="19"/>
+              </w:rPr>
+              <w:t xml:space="preserve">Padrão</w:t>
+            </w:r>
+          </w:p>
+        </w:tc>
+      </w:tr>
+      <w:tr>
+        <w:tc>
+          <w:tcPr>
+            <w:tcW w:type="dxa" w:w="2600"/>
+            <w:shd w:fill="FFFFFF" w:val="clear"/>
+            <w:tcMar>
+              <w:top w:type="dxa" w:w="60"/>
+              <w:left w:type="dxa" w:w="100"/>
+              <w:bottom w:type="dxa" w:w="60"/>
+              <w:right w:type="dxa" w:w="100"/>
+            </w:tcMar>
+          </w:tcPr>
+          <w:p>
+            <w:r>
+              <w:rPr>
+                <w:b/>
+                <w:bCs/>
+                <w:sz w:val="19"/>
+                <w:szCs w:val="19"/>
+              </w:rPr>
+              <w:t xml:space="preserve">Mostrar novidades</w:t>
+            </w:r>
+          </w:p>
+        </w:tc>
+        <w:tc>
+          <w:tcPr>
+            <w:tcW w:type="dxa" w:w="5560"/>
+            <w:shd w:fill="FFFFFF" w:val="clear"/>
+            <w:tcMar>
+              <w:top w:type="dxa" w:w="60"/>
+              <w:left w:type="dxa" w:w="100"/>
+              <w:bottom w:type="dxa" w:w="60"/>
+              <w:right w:type="dxa" w:w="100"/>
+            </w:tcMar>
+          </w:tcPr>
+          <w:p>
+            <w:r>
+              <w:rPr>
+                <w:sz w:val="19"/>
+                <w:szCs w:val="19"/>
+              </w:rPr>
+              <w:t xml:space="preserve">Mostra no painel o cartão de novidades depois de cada atualização.</w:t>
+            </w:r>
+          </w:p>
+        </w:tc>
+        <w:tc>
+          <w:tcPr>
+            <w:tcW w:type="dxa" w:w="1200"/>
+            <w:shd w:fill="FFFFFF" w:val="clear"/>
+            <w:tcMar>
+              <w:top w:type="dxa" w:w="60"/>
+              <w:left w:type="dxa" w:w="100"/>
+              <w:bottom w:type="dxa" w:w="60"/>
+              <w:right w:type="dxa" w:w="100"/>
+            </w:tcMar>
+          </w:tcPr>
+          <w:p>
+            <w:r>
+              <w:rPr>
+                <w:i/>
+                <w:iCs/>
+                <w:color w:val="6B7280"/>
+                <w:sz w:val="19"/>
+                <w:szCs w:val="19"/>
+              </w:rPr>
+              <w:t xml:space="preserve">Ligado</w:t>
+            </w:r>
+          </w:p>
+        </w:tc>
+      </w:tr>
+    </w:tbl>
+    <w:p>
+      <w:pPr>
+        <w:spacing w:after="120" w:line="276"/>
+      </w:pPr>
+      <w:r>
+        <w:t xml:space="preserve">No fim das Preferências fica o cartão "Sobre o CRATOS", com a versão instalada, o que a extensão faz com os seus dados e o botão "Ver novidades das versões".</w:t>
+      </w:r>
+    </w:p>
     <w:p>
       <w:r>
         <w:br w:type="page"/>
@@ -4456,7 +6664,7 @@
         <w:pStyle w:val="ListParagraph"/>
         <w:numPr>
           <w:ilvl w:val="0"/>
-          <w:numId w:val="3"/>
+          <w:numId w:val="4"/>
         </w:numPr>
         <w:spacing w:after="60" w:line="264"/>
       </w:pPr>
@@ -4476,7 +6684,7 @@
         <w:pStyle w:val="ListParagraph"/>
         <w:numPr>
           <w:ilvl w:val="0"/>
-          <w:numId w:val="3"/>
+          <w:numId w:val="4"/>
         </w:numPr>
         <w:spacing w:after="60" w:line="264"/>
       </w:pPr>
@@ -4496,7 +6704,7 @@
         <w:pStyle w:val="ListParagraph"/>
         <w:numPr>
           <w:ilvl w:val="0"/>
-          <w:numId w:val="3"/>
+          <w:numId w:val="4"/>
         </w:numPr>
         <w:spacing w:after="60" w:line="264"/>
       </w:pPr>
@@ -4516,7 +6724,7 @@
         <w:pStyle w:val="ListParagraph"/>
         <w:numPr>
           <w:ilvl w:val="0"/>
-          <w:numId w:val="3"/>
+          <w:numId w:val="4"/>
         </w:numPr>
         <w:spacing w:after="60" w:line="264"/>
       </w:pPr>
@@ -4536,23 +6744,7 @@
         <w:pStyle w:val="ListParagraph"/>
         <w:numPr>
           <w:ilvl w:val="0"/>
-          <w:numId w:val="3"/>
-        </w:numPr>
-        <w:spacing w:after="60" w:line="264"/>
-      </w:pPr>
-      <w:r>
-        <w:t xml:space="preserve">Os arquivos ficam na sua pasta de downloads, </w:t>
-      </w:r>
-      <w:r>
-        <w:t xml:space="preserve">na subpasta CRATOS (ou a que você configurar).</w:t>
-      </w:r>
-    </w:p>
-    <w:p>
-      <w:pPr>
-        <w:pStyle w:val="ListParagraph"/>
-        <w:numPr>
-          <w:ilvl w:val="0"/>
-          <w:numId w:val="3"/>
+          <w:numId w:val="4"/>
         </w:numPr>
         <w:spacing w:after="60" w:line="264"/>
       </w:pPr>
@@ -4561,10 +6753,66 @@
           <w:b/>
           <w:bCs/>
         </w:rPr>
-        <w:t xml:space="preserve">Nada sai da sua máquina. </w:t>
-      </w:r>
-      <w:r>
-        <w:t xml:space="preserve">O CRATOS não tem servidor próprio nem envia seus dados para lugar nenhum — ele só opera os sistemas oficiais, com o seu login.</w:t>
+        <w:t xml:space="preserve">Falha técnica nunca vira certidão negativa. </w:t>
+      </w:r>
+      <w:r>
+        <w:t xml:space="preserve">Se um sistema não responder como esperado, a certidão diz que a consulta não pôde ser concluída e deve ser repetida.</w:t>
+      </w:r>
+    </w:p>
+    <w:p>
+      <w:pPr>
+        <w:pStyle w:val="ListParagraph"/>
+        <w:numPr>
+          <w:ilvl w:val="0"/>
+          <w:numId w:val="4"/>
+        </w:numPr>
+        <w:spacing w:after="60" w:line="264"/>
+      </w:pPr>
+      <w:r>
+        <w:t xml:space="preserve">Os arquivos ficam na sua pasta de downloads, </w:t>
+      </w:r>
+      <w:r>
+        <w:t xml:space="preserve">na subpasta CRATOS (ou a que você configurar).</w:t>
+      </w:r>
+    </w:p>
+    <w:p>
+      <w:pPr>
+        <w:pStyle w:val="ListParagraph"/>
+        <w:numPr>
+          <w:ilvl w:val="0"/>
+          <w:numId w:val="4"/>
+        </w:numPr>
+        <w:spacing w:after="60" w:line="264"/>
+      </w:pPr>
+      <w:r>
+        <w:rPr>
+          <w:b/>
+          <w:bCs/>
+        </w:rPr>
+        <w:t xml:space="preserve">Junte antes de fechar a aba do processo. </w:t>
+      </w:r>
+      <w:r>
+        <w:t xml:space="preserve">Ao fechar a aba, os dados daquele processo são apagados do navegador (veja 5.10).</w:t>
+      </w:r>
+    </w:p>
+    <w:p>
+      <w:pPr>
+        <w:pStyle w:val="ListParagraph"/>
+        <w:numPr>
+          <w:ilvl w:val="0"/>
+          <w:numId w:val="4"/>
+        </w:numPr>
+        <w:spacing w:after="60" w:line="264"/>
+      </w:pPr>
+      <w:r>
+        <w:rPr>
+          <w:b/>
+          <w:bCs/>
+        </w:rPr>
+        <w:t xml:space="preserve">Dados de processo não saem da sua máquina. </w:t>
+      </w:r>
+      <w:r>
+        <w:t xml:space="preserve">O CRATOS não tem servidor próprio nem telemetria — ele só opera os sistemas oficiais, com o seu login. A única consulta externa é a do Firefox à lista de versões do CRATOS, para a atualização automática, e nela não vai nenhum dado de processo.</w:t>
       </w:r>
     </w:p>
     <w:p>
@@ -4586,7 +6834,7 @@
           <w:bCs/>
           <w:color w:val="1F3A5F"/>
         </w:rPr>
-        <w:t xml:space="preserve">Instalei e o ícone não aparece.</w:t>
+        <w:t xml:space="preserve">Instalei e o botão do CRATOS não aparece.</w:t>
       </w:r>
     </w:p>
     <w:p>
@@ -4594,7 +6842,7 @@
         <w:spacing w:after="120" w:line="276"/>
       </w:pPr>
       <w:r>
-        <w:t xml:space="preserve">Abra um processo no PJe, na tela de detalhes — o ícone do CRATOS aparece nesse contexto. Se mesmo assim não surgir, confirme em about:addons se a extensão está ativada.</w:t>
+        <w:t xml:space="preserve">Abra um processo no PJe, na tela de detalhes — o botão flutuante do CRATOS aparece nesse contexto. Se mesmo assim não surgir, confirme em about:addons se a extensão está ativada.</w:t>
       </w:r>
     </w:p>
     <w:p>
@@ -4658,6 +6906,90 @@
       </w:pPr>
       <w:r>
         <w:t xml:space="preserve">É normal: o INFOJUD responde depois, na caixa postal. Tente de novo mais tarde pelo botão "Localizar resultado na caixa postal".</w:t>
+      </w:r>
+    </w:p>
+    <w:p>
+      <w:pPr>
+        <w:spacing w:after="40" w:before="120"/>
+      </w:pPr>
+      <w:r>
+        <w:rPr>
+          <w:b/>
+          <w:bCs/>
+          <w:color w:val="1F3A5F"/>
+        </w:rPr>
+        <w:t xml:space="preserve">O CCS ou o PREVJUD não respondeu na hora.</w:t>
+      </w:r>
+    </w:p>
+    <w:p>
+      <w:pPr>
+        <w:spacing w:after="120" w:line="276"/>
+      </w:pPr>
+      <w:r>
+        <w:t xml:space="preserve">Também é normal. Use "Coletar CCS" no dia seguinte, ou "Coletar PREVJUD" mais tarde (veja 5.7).</w:t>
+      </w:r>
+    </w:p>
+    <w:p>
+      <w:pPr>
+        <w:spacing w:after="40" w:before="120"/>
+      </w:pPr>
+      <w:r>
+        <w:rPr>
+          <w:b/>
+          <w:bCs/>
+          <w:color w:val="1F3A5F"/>
+        </w:rPr>
+        <w:t xml:space="preserve">Fechei a aba do processo e a juntada não oferece mais as certidões.</w:t>
+      </w:r>
+    </w:p>
+    <w:p>
+      <w:pPr>
+        <w:spacing w:after="120" w:line="276"/>
+      </w:pPr>
+      <w:r>
+        <w:t xml:space="preserve">Ao fechar a aba, o CRATOS apaga os dados daquele processo. Os arquivos continuam na sua pasta de downloads: anexe à mão ou refaça o convênio (veja 5.10).</w:t>
+      </w:r>
+    </w:p>
+    <w:p>
+      <w:pPr>
+        <w:spacing w:after="40" w:before="120"/>
+      </w:pPr>
+      <w:r>
+        <w:rPr>
+          <w:b/>
+          <w:bCs/>
+          <w:color w:val="1F3A5F"/>
+        </w:rPr>
+        <w:t xml:space="preserve">O sistema do convênio estava fora do ar.</w:t>
+      </w:r>
+    </w:p>
+    <w:p>
+      <w:pPr>
+        <w:spacing w:after="120" w:line="276"/>
+      </w:pPr>
+      <w:r>
+        <w:t xml:space="preserve">Use "Verificar disponibilidade do convênio" no painel. Se a indisponibilidade se confirmar, você pode gerar a certidão (veja 5.8).</w:t>
+      </w:r>
+    </w:p>
+    <w:p>
+      <w:pPr>
+        <w:spacing w:after="40" w:before="120"/>
+      </w:pPr>
+      <w:r>
+        <w:rPr>
+          <w:b/>
+          <w:bCs/>
+          <w:color w:val="1F3A5F"/>
+        </w:rPr>
+        <w:t xml:space="preserve">Como recebo as versões novas?</w:t>
+      </w:r>
+    </w:p>
+    <w:p>
+      <w:pPr>
+        <w:spacing w:after="120" w:line="276"/>
+      </w:pPr>
+      <w:r>
+        <w:t xml:space="preserve">Sozinho: o Firefox atualiza o CRATOS automaticamente. Depois de cada atualização, o painel mostra o que mudou.</w:t>
       </w:r>
     </w:p>
     <w:p>
@@ -4726,10 +7058,6 @@
 </w:document>
 </file>
 
-<file path=word/comments.xml><?xml version="1.0" encoding="utf-8"?>
-<w:comments xmlns:cx="http://schemas.microsoft.com/office/drawing/2014/chartex" xmlns:cx1="http://schemas.microsoft.com/office/drawing/2015/9/8/chartex" xmlns:cx2="http://schemas.microsoft.com/office/drawing/2015/10/21/chartex" xmlns:cx3="http://schemas.microsoft.com/office/drawing/2016/5/9/chartex" xmlns:cx4="http://schemas.microsoft.com/office/drawing/2016/5/10/chartex" xmlns:cx5="http://schemas.microsoft.com/office/drawing/2016/5/11/chartex" xmlns:cx6="http://schemas.microsoft.com/office/drawing/2016/5/12/chartex" xmlns:cx7="http://schemas.microsoft.com/office/drawing/2016/5/13/chartex" xmlns:cx8="http://schemas.microsoft.com/office/drawing/2016/5/14/chartex" xmlns:mc="http://schemas.openxmlformats.org/markup-compatibility/2006" xmlns:aink="http://schemas.microsoft.com/office/drawing/2016/ink" xmlns:am3d="http://schemas.microsoft.com/office/drawing/2017/model3d" xmlns:o="urn:schemas-microsoft-com:office:office" xmlns:r="http://schemas.openxmlformats.org/officeDocument/2006/relationships" xmlns:m="http://schemas.openxmlformats.org/officeDocument/2006/math" xmlns:v="urn:schemas-microsoft-com:vml" xmlns:wp14="http://schemas.microsoft.com/office/word/2010/wordprocessingDrawing" xmlns:wp="http://schemas.openxmlformats.org/drawingml/2006/wordprocessingDrawing" xmlns:w10="urn:schemas-microsoft-com:office:word" xmlns:w="http://schemas.openxmlformats.org/wordprocessingml/2006/main" xmlns:w14="http://schemas.microsoft.com/office/word/2010/wordml" xmlns:w15="http://schemas.microsoft.com/office/word/2012/wordml" xmlns:w16cex="http://schemas.microsoft.com/office/word/2018/wordml/cex" xmlns:w16cid="http://schemas.microsoft.com/office/word/2016/wordml/cid" xmlns:w16="http://schemas.microsoft.com/office/word/2018/wordml" xmlns:w16sdtdh="http://schemas.microsoft.com/office/word/2020/wordml/sdtdatahash" xmlns:w16se="http://schemas.microsoft.com/office/word/2015/wordml/symex" xmlns:wpg="http://schemas.microsoft.com/office/word/2010/wordprocessingGroup" xmlns:wpi="http://schemas.microsoft.com/office/word/2010/wordprocessingInk" xmlns:wne="http://schemas.microsoft.com/office/word/2006/wordml" xmlns:wps="http://schemas.microsoft.com/office/word/2010/wordprocessingShape"/>
-</file>
-
 <file path=word/endnotes.xml><?xml version="1.0" encoding="utf-8"?>
 <w:endnotes xmlns:wpc="http://schemas.microsoft.com/office/word/2010/wordprocessingCanvas" xmlns:mc="http://schemas.openxmlformats.org/markup-compatibility/2006" xmlns:o="urn:schemas-microsoft-com:office:office" xmlns:r="http://schemas.openxmlformats.org/officeDocument/2006/relationships" xmlns:m="http://schemas.openxmlformats.org/officeDocument/2006/math" xmlns:v="urn:schemas-microsoft-com:vml" xmlns:wp14="http://schemas.microsoft.com/office/word/2010/wordprocessingDrawing" xmlns:wp="http://schemas.openxmlformats.org/drawingml/2006/wordprocessingDrawing" xmlns:w10="urn:schemas-microsoft-com:office:word" xmlns:w="http://schemas.openxmlformats.org/wordprocessingml/2006/main" xmlns:w14="http://schemas.microsoft.com/office/word/2010/wordml" xmlns:w15="http://schemas.microsoft.com/office/word/2012/wordml" xmlns:wpg="http://schemas.microsoft.com/office/word/2010/wordprocessingGroup" xmlns:wpi="http://schemas.microsoft.com/office/word/2010/wordprocessingInk" xmlns:wne="http://schemas.microsoft.com/office/word/2006/wordml" xmlns:wps="http://schemas.microsoft.com/office/word/2010/wordprocessingShape" mc:Ignorable="w14 w15 wp14">
   <w:endnote w:type="separator" w:id="-1">
@@ -4808,7 +7136,7 @@
 <w:numbering xmlns:wpc="http://schemas.microsoft.com/office/word/2010/wordprocessingCanvas" xmlns:mc="http://schemas.openxmlformats.org/markup-compatibility/2006" xmlns:o="urn:schemas-microsoft-com:office:office" xmlns:r="http://schemas.openxmlformats.org/officeDocument/2006/relationships" xmlns:m="http://schemas.openxmlformats.org/officeDocument/2006/math" xmlns:v="urn:schemas-microsoft-com:vml" xmlns:wp14="http://schemas.microsoft.com/office/word/2010/wordprocessingDrawing" xmlns:wp="http://schemas.openxmlformats.org/drawingml/2006/wordprocessingDrawing" xmlns:w10="urn:schemas-microsoft-com:office:word" xmlns:w="http://schemas.openxmlformats.org/wordprocessingml/2006/main" xmlns:w14="http://schemas.microsoft.com/office/word/2010/wordml" xmlns:w15="http://schemas.microsoft.com/office/word/2012/wordml" xmlns:wpg="http://schemas.microsoft.com/office/word/2010/wordprocessingGroup" xmlns:wpi="http://schemas.microsoft.com/office/word/2010/wordprocessingInk" xmlns:wne="http://schemas.microsoft.com/office/word/2006/wordml" xmlns:wps="http://schemas.microsoft.com/office/word/2010/wordprocessingShape" mc:Ignorable="w14 w15 wp14">
   <w:abstractNum w:abstractNumId="1" w15:restartNumberingAfterBreak="0">
     <w:multiLevelType w:val="hybridMultilevel"/>
-    <w:lvl w:ilvl="0" w15:tentative="1">
+    <w:lvl w:ilvl="0" w:tentative="1">
       <w:start w:val="1"/>
       <w:numFmt w:val="bullet"/>
       <w:lvlText w:val="●"/>
@@ -4817,7 +7145,7 @@
         <w:ind w:left="720" w:hanging="360"/>
       </w:pPr>
     </w:lvl>
-    <w:lvl w:ilvl="1" w15:tentative="1">
+    <w:lvl w:ilvl="1" w:tentative="1">
       <w:start w:val="1"/>
       <w:numFmt w:val="bullet"/>
       <w:lvlText w:val="○"/>
@@ -4826,7 +7154,7 @@
         <w:ind w:left="1440" w:hanging="360"/>
       </w:pPr>
     </w:lvl>
-    <w:lvl w:ilvl="2" w15:tentative="1">
+    <w:lvl w:ilvl="2" w:tentative="1">
       <w:start w:val="1"/>
       <w:numFmt w:val="bullet"/>
       <w:lvlText w:val="■"/>
@@ -4835,7 +7163,7 @@
         <w:ind w:left="2160" w:hanging="360"/>
       </w:pPr>
     </w:lvl>
-    <w:lvl w:ilvl="3" w15:tentative="1">
+    <w:lvl w:ilvl="3" w:tentative="1">
       <w:start w:val="1"/>
       <w:numFmt w:val="bullet"/>
       <w:lvlText w:val="●"/>
@@ -4844,7 +7172,7 @@
         <w:ind w:left="2880" w:hanging="360"/>
       </w:pPr>
     </w:lvl>
-    <w:lvl w:ilvl="4" w15:tentative="1">
+    <w:lvl w:ilvl="4" w:tentative="1">
       <w:start w:val="1"/>
       <w:numFmt w:val="bullet"/>
       <w:lvlText w:val="○"/>
@@ -4853,7 +7181,7 @@
         <w:ind w:left="3600" w:hanging="360"/>
       </w:pPr>
     </w:lvl>
-    <w:lvl w:ilvl="5" w15:tentative="1">
+    <w:lvl w:ilvl="5" w:tentative="1">
       <w:start w:val="1"/>
       <w:numFmt w:val="bullet"/>
       <w:lvlText w:val="■"/>
@@ -4862,7 +7190,7 @@
         <w:ind w:left="4320" w:hanging="360"/>
       </w:pPr>
     </w:lvl>
-    <w:lvl w:ilvl="6" w15:tentative="1">
+    <w:lvl w:ilvl="6" w:tentative="1">
       <w:start w:val="1"/>
       <w:numFmt w:val="bullet"/>
       <w:lvlText w:val="●"/>
@@ -4871,7 +7199,7 @@
         <w:ind w:left="5040" w:hanging="360"/>
       </w:pPr>
     </w:lvl>
-    <w:lvl w:ilvl="7" w15:tentative="1">
+    <w:lvl w:ilvl="7" w:tentative="1">
       <w:start w:val="1"/>
       <w:numFmt w:val="bullet"/>
       <w:lvlText w:val="●"/>
@@ -4880,7 +7208,7 @@
         <w:ind w:left="5760" w:hanging="360"/>
       </w:pPr>
     </w:lvl>
-    <w:lvl w:ilvl="8" w15:tentative="1">
+    <w:lvl w:ilvl="8" w:tentative="1">
       <w:start w:val="1"/>
       <w:numFmt w:val="bullet"/>
       <w:lvlText w:val="●"/>
@@ -4892,7 +7220,7 @@
   </w:abstractNum>
   <w:abstractNum w:abstractNumId="2" w15:restartNumberingAfterBreak="0">
     <w:multiLevelType w:val="hybridMultilevel"/>
-    <w:lvl w:ilvl="0" w15:tentative="1">
+    <w:lvl w:ilvl="0" w:tentative="1">
       <w:start w:val="1"/>
       <w:numFmt w:val="bullet"/>
       <w:lvlText w:val="•"/>
@@ -4904,7 +7232,7 @@
   </w:abstractNum>
   <w:abstractNum w:abstractNumId="3" w15:restartNumberingAfterBreak="0">
     <w:multiLevelType w:val="hybridMultilevel"/>
-    <w:lvl w:ilvl="0" w15:tentative="1">
+    <w:lvl w:ilvl="0" w:tentative="1">
       <w:start w:val="1"/>
       <w:numFmt w:val="decimal"/>
       <w:lvlText w:val="%1."/>
@@ -4927,6 +7255,12 @@
     </w:lvlOverride>
   </w:num>
   <w:num w:numId="3">
+    <w:abstractNumId w:val="3"/>
+    <w:lvlOverride w:ilvl="0">
+      <w:startOverride w:val="1"/>
+    </w:lvlOverride>
+  </w:num>
+  <w:num w:numId="4">
     <w:abstractNumId w:val="2"/>
     <w:lvlOverride w:ilvl="0">
       <w:startOverride w:val="1"/>
@@ -4948,6 +7282,25 @@
     </w:rPrDefault>
     <w:pPrDefault/>
   </w:docDefaults>
+  <w:style w:type="paragraph" w:styleId="Normal" w:default="1">
+    <w:name w:val="Normal"/>
+    <w:qFormat/>
+  </w:style>
+  <w:style w:type="table" w:styleId="TableNormal" w:default="true">
+    <w:name w:val="Normal Table"/>
+    <w:uiPriority w:val="99"/>
+    <w:semiHidden/>
+    <w:unhideWhenUsed/>
+    <w:tblPr>
+      <w:tblInd w:type="dxa" w:w="0"/>
+      <w:tblCellMar>
+        <w:top w:type="dxa" w:w="0"/>
+        <w:left w:type="dxa" w:w="108"/>
+        <w:bottom w:type="dxa" w:w="0"/>
+        <w:right w:type="dxa" w:w="108"/>
+      </w:tblCellMar>
+    </w:tblPr>
+  </w:style>
   <w:style w:type="paragraph" w:styleId="Title">
     <w:name w:val="Title"/>
     <w:basedOn w:val="Normal"/>
@@ -4956,28 +7309,6 @@
     <w:rPr>
       <w:sz w:val="56"/>
       <w:szCs w:val="56"/>
-    </w:rPr>
-  </w:style>
-  <w:style w:type="paragraph" w:styleId="Heading1">
-    <w:name w:val="Heading 1"/>
-    <w:basedOn w:val="Normal"/>
-    <w:next w:val="Normal"/>
-    <w:qFormat/>
-    <w:rPr>
-      <w:color w:val="2E74B5"/>
-      <w:sz w:val="32"/>
-      <w:szCs w:val="32"/>
-    </w:rPr>
-  </w:style>
-  <w:style w:type="paragraph" w:styleId="Heading2">
-    <w:name w:val="Heading 2"/>
-    <w:basedOn w:val="Normal"/>
-    <w:next w:val="Normal"/>
-    <w:qFormat/>
-    <w:rPr>
-      <w:color w:val="2E74B5"/>
-      <w:sz w:val="26"/>
-      <w:szCs w:val="26"/>
     </w:rPr>
   </w:style>
   <w:style w:type="paragraph" w:styleId="Heading3">
@@ -5034,6 +7365,139 @@
     <w:name w:val="List Paragraph"/>
     <w:basedOn w:val="Normal"/>
     <w:qFormat/>
+  </w:style>
+  <w:style w:type="paragraph" w:styleId="Caption">
+    <w:name w:val="caption"/>
+    <w:basedOn w:val="Normal"/>
+    <w:next w:val="Normal"/>
+    <w:uiPriority w:val="35"/>
+    <w:semiHidden/>
+    <w:unhideWhenUsed/>
+    <w:qFormat/>
+    <w:pPr>
+      <w:spacing w:after="200"/>
+    </w:pPr>
+    <w:rPr>
+      <w:i/>
+      <w:iCs/>
+      <w:color w:val="44546A" w:themeColor="dark2"/>
+      <w:sz w:val="18"/>
+      <w:szCs w:val="18"/>
+    </w:rPr>
+  </w:style>
+  <w:style w:type="paragraph" w:styleId="Bibliography">
+    <w:name w:val="Bibliography"/>
+    <w:basedOn w:val="Normal"/>
+    <w:next w:val="Normal"/>
+    <w:uiPriority w:val="37"/>
+    <w:unhideWhenUsed/>
+  </w:style>
+  <w:style w:type="paragraph" w:styleId="TOC1">
+    <w:name w:val="toc 1"/>
+    <w:basedOn w:val="Normal"/>
+    <w:next w:val="Normal"/>
+    <w:uiPriority w:val="39"/>
+    <w:semiHidden/>
+    <w:unhideWhenUsed/>
+    <w:pPr>
+      <w:spacing w:after="100"/>
+    </w:pPr>
+  </w:style>
+  <w:style w:type="paragraph" w:styleId="TOC2">
+    <w:name w:val="toc 2"/>
+    <w:basedOn w:val="Normal"/>
+    <w:next w:val="Normal"/>
+    <w:uiPriority w:val="39"/>
+    <w:semiHidden/>
+    <w:unhideWhenUsed/>
+    <w:pPr>
+      <w:spacing w:after="100"/>
+      <w:ind w:left="220"/>
+    </w:pPr>
+  </w:style>
+  <w:style w:type="paragraph" w:styleId="TOC3">
+    <w:name w:val="toc 3"/>
+    <w:basedOn w:val="Normal"/>
+    <w:next w:val="Normal"/>
+    <w:uiPriority w:val="39"/>
+    <w:semiHidden/>
+    <w:unhideWhenUsed/>
+    <w:pPr>
+      <w:spacing w:after="100"/>
+      <w:ind w:left="440"/>
+    </w:pPr>
+  </w:style>
+  <w:style w:type="paragraph" w:styleId="TOC4">
+    <w:name w:val="toc 4"/>
+    <w:basedOn w:val="Normal"/>
+    <w:next w:val="Normal"/>
+    <w:uiPriority w:val="39"/>
+    <w:semiHidden/>
+    <w:unhideWhenUsed/>
+    <w:pPr>
+      <w:spacing w:after="100"/>
+      <w:ind w:left="660"/>
+    </w:pPr>
+  </w:style>
+  <w:style w:type="paragraph" w:styleId="TOC5">
+    <w:name w:val="toc 5"/>
+    <w:basedOn w:val="Normal"/>
+    <w:next w:val="Normal"/>
+    <w:uiPriority w:val="39"/>
+    <w:semiHidden/>
+    <w:unhideWhenUsed/>
+    <w:pPr>
+      <w:spacing w:after="100"/>
+      <w:ind w:left="880"/>
+    </w:pPr>
+  </w:style>
+  <w:style w:type="paragraph" w:styleId="TOC6">
+    <w:name w:val="toc 6"/>
+    <w:basedOn w:val="Normal"/>
+    <w:next w:val="Normal"/>
+    <w:uiPriority w:val="39"/>
+    <w:semiHidden/>
+    <w:unhideWhenUsed/>
+    <w:pPr>
+      <w:spacing w:after="100"/>
+      <w:ind w:left="1100"/>
+    </w:pPr>
+  </w:style>
+  <w:style w:type="paragraph" w:styleId="TOC7">
+    <w:name w:val="toc 7"/>
+    <w:basedOn w:val="Normal"/>
+    <w:next w:val="Normal"/>
+    <w:uiPriority w:val="39"/>
+    <w:semiHidden/>
+    <w:unhideWhenUsed/>
+    <w:pPr>
+      <w:spacing w:after="100"/>
+      <w:ind w:left="1320"/>
+    </w:pPr>
+  </w:style>
+  <w:style w:type="paragraph" w:styleId="TOC8">
+    <w:name w:val="toc 8"/>
+    <w:basedOn w:val="Normal"/>
+    <w:next w:val="Normal"/>
+    <w:uiPriority w:val="39"/>
+    <w:semiHidden/>
+    <w:unhideWhenUsed/>
+    <w:pPr>
+      <w:spacing w:after="100"/>
+      <w:ind w:left="1540"/>
+    </w:pPr>
+  </w:style>
+  <w:style w:type="paragraph" w:styleId="TOC9">
+    <w:name w:val="toc 9"/>
+    <w:basedOn w:val="Normal"/>
+    <w:next w:val="Normal"/>
+    <w:uiPriority w:val="39"/>
+    <w:semiHidden/>
+    <w:unhideWhenUsed/>
+    <w:pPr>
+      <w:spacing w:after="100"/>
+      <w:ind w:left="1760"/>
+    </w:pPr>
   </w:style>
   <w:style w:type="character" w:styleId="Hyperlink">
     <w:name w:val="Hyperlink"/>
@@ -5119,6 +7583,13 @@
       <w:szCs w:val="20"/>
     </w:rPr>
   </w:style>
+  <w:style w:type="character" w:styleId="LineNumber">
+    <w:name w:val="line number"/>
+    <w:basedOn w:val="DefaultParagraphFont"/>
+    <w:uiPriority w:val="99"/>
+    <w:semiHidden/>
+    <w:unhideWhenUsed/>
+  </w:style>
   <w:style w:type="paragraph" w:styleId="Heading1">
     <w:name w:val="Heading 1"/>
     <w:basedOn w:val="Normal"/>
@@ -5152,4 +7623,294 @@
     </w:rPr>
   </w:style>
 </w:styles>
+</file>
+
+<file path=word/theme/theme1.xml><?xml version="1.0" encoding="utf-8"?>
+<a:theme xmlns:a="http://schemas.openxmlformats.org/drawingml/2006/main" name="Office Theme">
+  <a:themeElements>
+    <a:clrScheme name="Office">
+      <a:dk1>
+        <a:sysClr val="windowText" lastClr="000000"/>
+      </a:dk1>
+      <a:lt1>
+        <a:sysClr val="window" lastClr="FFFFFF"/>
+      </a:lt1>
+      <a:dk2>
+        <a:srgbClr val="44546A"/>
+      </a:dk2>
+      <a:lt2>
+        <a:srgbClr val="E7E6E6"/>
+      </a:lt2>
+      <a:accent1>
+        <a:srgbClr val="4472C4"/>
+      </a:accent1>
+      <a:accent2>
+        <a:srgbClr val="ED7D31"/>
+      </a:accent2>
+      <a:accent3>
+        <a:srgbClr val="A5A5A5"/>
+      </a:accent3>
+      <a:accent4>
+        <a:srgbClr val="FFC000"/>
+      </a:accent4>
+      <a:accent5>
+        <a:srgbClr val="5B9BD5"/>
+      </a:accent5>
+      <a:accent6>
+        <a:srgbClr val="70AD47"/>
+      </a:accent6>
+      <a:hlink>
+        <a:srgbClr val="0563C1"/>
+      </a:hlink>
+      <a:folHlink>
+        <a:srgbClr val="954F72"/>
+      </a:folHlink>
+    </a:clrScheme>
+    <a:fontScheme name="Office">
+      <a:majorFont>
+        <a:latin typeface="Calibri Light" panose="020F0302020204030204"/>
+        <a:ea typeface=""/>
+        <a:cs typeface=""/>
+        <a:font script="Jpan" typeface="游ゴシック Light"/>
+        <a:font script="Hang" typeface="맑은 고딕"/>
+        <a:font script="Hans" typeface="等线 Light"/>
+        <a:font script="Hant" typeface="新細明體"/>
+        <a:font script="Arab" typeface="Times New Roman"/>
+        <a:font script="Hebr" typeface="Times New Roman"/>
+        <a:font script="Thai" typeface="Angsana New"/>
+        <a:font script="Ethi" typeface="Nyala"/>
+        <a:font script="Beng" typeface="Vrinda"/>
+        <a:font script="Gujr" typeface="Shruti"/>
+        <a:font script="Khmr" typeface="MoolBoran"/>
+        <a:font script="Knda" typeface="Tunga"/>
+        <a:font script="Guru" typeface="Raavi"/>
+        <a:font script="Cans" typeface="Euphemia"/>
+        <a:font script="Cher" typeface="Plantagenet Cherokee"/>
+        <a:font script="Yiii" typeface="Microsoft Yi Baiti"/>
+        <a:font script="Tibt" typeface="Microsoft Himalaya"/>
+        <a:font script="Thaa" typeface="MV Boli"/>
+        <a:font script="Deva" typeface="Mangal"/>
+        <a:font script="Telu" typeface="Gautami"/>
+        <a:font script="Taml" typeface="Latha"/>
+        <a:font script="Syrc" typeface="Estrangelo Edessa"/>
+        <a:font script="Orya" typeface="Kalinga"/>
+        <a:font script="Mlym" typeface="Kartika"/>
+        <a:font script="Laoo" typeface="DokChampa"/>
+        <a:font script="Sinh" typeface="Iskoola Pota"/>
+        <a:font script="Mong" typeface="Mongolian Baiti"/>
+        <a:font script="Viet" typeface="Times New Roman"/>
+        <a:font script="Uigh" typeface="Microsoft Uighur"/>
+        <a:font script="Geor" typeface="Sylfaen"/>
+        <a:font script="Armn" typeface="Arial"/>
+        <a:font script="Bugi" typeface="Leelawadee UI"/>
+        <a:font script="Bopo" typeface="Microsoft JhengHei"/>
+        <a:font script="Java" typeface="Javanese Text"/>
+        <a:font script="Lisu" typeface="Segoe UI"/>
+        <a:font script="Mymr" typeface="Myanmar Text"/>
+        <a:font script="Nkoo" typeface="Ebrima"/>
+        <a:font script="Olck" typeface="Nirmala UI"/>
+        <a:font script="Osma" typeface="Ebrima"/>
+        <a:font script="Phag" typeface="Phagspa"/>
+        <a:font script="Syrn" typeface="Estrangelo Edessa"/>
+        <a:font script="Syrj" typeface="Estrangelo Edessa"/>
+        <a:font script="Syre" typeface="Estrangelo Edessa"/>
+        <a:font script="Sora" typeface="Nirmala UI"/>
+        <a:font script="Tale" typeface="Microsoft Tai Le"/>
+        <a:font script="Talu" typeface="Microsoft New Tai Lue"/>
+        <a:font script="Tfng" typeface="Ebrima"/>
+      </a:majorFont>
+      <a:minorFont>
+        <a:latin typeface="Calibri" panose="020F0502020204030204"/>
+        <a:ea typeface=""/>
+        <a:cs typeface=""/>
+        <a:font script="Jpan" typeface="游明朝"/>
+        <a:font script="Hang" typeface="맑은 고딕"/>
+        <a:font script="Hans" typeface="等线"/>
+        <a:font script="Hant" typeface="新細明體"/>
+        <a:font script="Arab" typeface="Arial"/>
+        <a:font script="Hebr" typeface="Arial"/>
+        <a:font script="Thai" typeface="Cordia New"/>
+        <a:font script="Ethi" typeface="Nyala"/>
+        <a:font script="Beng" typeface="Vrinda"/>
+        <a:font script="Gujr" typeface="Shruti"/>
+        <a:font script="Khmr" typeface="DaunPenh"/>
+        <a:font script="Knda" typeface="Tunga"/>
+        <a:font script="Guru" typeface="Raavi"/>
+        <a:font script="Cans" typeface="Euphemia"/>
+        <a:font script="Cher" typeface="Plantagenet Cherokee"/>
+        <a:font script="Yiii" typeface="Microsoft Yi Baiti"/>
+        <a:font script="Tibt" typeface="Microsoft Himalaya"/>
+        <a:font script="Thaa" typeface="MV Boli"/>
+        <a:font script="Deva" typeface="Mangal"/>
+        <a:font script="Telu" typeface="Gautami"/>
+        <a:font script="Taml" typeface="Latha"/>
+        <a:font script="Syrc" typeface="Estrangelo Edessa"/>
+        <a:font script="Orya" typeface="Kalinga"/>
+        <a:font script="Mlym" typeface="Kartika"/>
+        <a:font script="Laoo" typeface="DokChampa"/>
+        <a:font script="Sinh" typeface="Iskoola Pota"/>
+        <a:font script="Mong" typeface="Mongolian Baiti"/>
+        <a:font script="Viet" typeface="Arial"/>
+        <a:font script="Uigh" typeface="Microsoft Uighur"/>
+        <a:font script="Geor" typeface="Sylfaen"/>
+        <a:font script="Armn" typeface="Arial"/>
+        <a:font script="Bugi" typeface="Leelawadee UI"/>
+        <a:font script="Bopo" typeface="Microsoft JhengHei"/>
+        <a:font script="Java" typeface="Javanese Text"/>
+        <a:font script="Lisu" typeface="Segoe UI"/>
+        <a:font script="Mymr" typeface="Myanmar Text"/>
+        <a:font script="Nkoo" typeface="Ebrima"/>
+        <a:font script="Olck" typeface="Nirmala UI"/>
+        <a:font script="Osma" typeface="Ebrima"/>
+        <a:font script="Phag" typeface="Phagspa"/>
+        <a:font script="Syrn" typeface="Estrangelo Edessa"/>
+        <a:font script="Syrj" typeface="Estrangelo Edessa"/>
+        <a:font script="Syre" typeface="Estrangelo Edessa"/>
+        <a:font script="Sora" typeface="Nirmala UI"/>
+        <a:font script="Tale" typeface="Microsoft Tai Le"/>
+        <a:font script="Talu" typeface="Microsoft New Tai Lue"/>
+        <a:font script="Tfng" typeface="Ebrima"/>
+      </a:minorFont>
+    </a:fontScheme>
+    <a:fmtScheme name="Office">
+      <a:fillStyleLst>
+        <a:solidFill>
+          <a:schemeClr val="phClr"/>
+        </a:solidFill>
+        <a:gradFill rotWithShape="true">
+          <a:gsLst>
+            <a:gs pos="0">
+              <a:schemeClr val="phClr">
+                <a:lumMod val="110000"/>
+                <a:satMod val="105000"/>
+                <a:tint val="67000"/>
+              </a:schemeClr>
+            </a:gs>
+            <a:gs pos="50000">
+              <a:schemeClr val="phClr">
+                <a:lumMod val="105000"/>
+                <a:satMod val="103000"/>
+                <a:tint val="73000"/>
+              </a:schemeClr>
+            </a:gs>
+            <a:gs pos="100000">
+              <a:schemeClr val="phClr">
+                <a:lumMod val="105000"/>
+                <a:satMod val="109000"/>
+                <a:tint val="81000"/>
+              </a:schemeClr>
+            </a:gs>
+          </a:gsLst>
+          <a:lin ang="5400000" scaled="false"/>
+        </a:gradFill>
+        <a:gradFill rotWithShape="true">
+          <a:gsLst>
+            <a:gs pos="0">
+              <a:schemeClr val="phClr">
+                <a:satMod val="103000"/>
+                <a:lumMod val="102000"/>
+                <a:tint val="94000"/>
+              </a:schemeClr>
+            </a:gs>
+            <a:gs pos="50000">
+              <a:schemeClr val="phClr">
+                <a:satMod val="110000"/>
+                <a:lumMod val="100000"/>
+                <a:shade val="100000"/>
+              </a:schemeClr>
+            </a:gs>
+            <a:gs pos="100000">
+              <a:schemeClr val="phClr">
+                <a:lumMod val="99000"/>
+                <a:satMod val="120000"/>
+                <a:shade val="78000"/>
+              </a:schemeClr>
+            </a:gs>
+          </a:gsLst>
+          <a:lin ang="5400000" scaled="false"/>
+        </a:gradFill>
+      </a:fillStyleLst>
+      <a:lnStyleLst>
+        <a:ln w="6350" cap="flat" cmpd="sng" algn="ctr">
+          <a:solidFill>
+            <a:schemeClr val="phClr"/>
+          </a:solidFill>
+          <a:prstDash val="solid"/>
+          <a:miter lim="800000"/>
+        </a:ln>
+        <a:ln w="12700" cap="flat" cmpd="sng" algn="ctr">
+          <a:solidFill>
+            <a:schemeClr val="phClr"/>
+          </a:solidFill>
+          <a:prstDash val="solid"/>
+          <a:miter lim="800000"/>
+        </a:ln>
+        <a:ln w="19050" cap="flat" cmpd="sng" algn="ctr">
+          <a:solidFill>
+            <a:schemeClr val="phClr"/>
+          </a:solidFill>
+          <a:prstDash val="solid"/>
+          <a:miter lim="800000"/>
+        </a:ln>
+      </a:lnStyleLst>
+      <a:effectStyleLst>
+        <a:effectStyle>
+          <a:effectLst/>
+        </a:effectStyle>
+        <a:effectStyle>
+          <a:effectLst/>
+        </a:effectStyle>
+        <a:effectStyle>
+          <a:effectLst>
+            <a:outerShdw blurRad="57150" dist="19050" dir="5400000" algn="ctr" rotWithShape="false">
+              <a:srgbClr val="000000">
+                <a:alpha val="63000"/>
+              </a:srgbClr>
+            </a:outerShdw>
+          </a:effectLst>
+        </a:effectStyle>
+      </a:effectStyleLst>
+      <a:bgFillStyleLst>
+        <a:solidFill>
+          <a:schemeClr val="phClr"/>
+        </a:solidFill>
+        <a:solidFill>
+          <a:schemeClr val="phClr">
+            <a:tint val="95000"/>
+            <a:satMod val="170000"/>
+          </a:schemeClr>
+        </a:solidFill>
+        <a:gradFill rotWithShape="true">
+          <a:gsLst>
+            <a:gs pos="0">
+              <a:schemeClr val="phClr">
+                <a:tint val="93000"/>
+                <a:satMod val="150000"/>
+                <a:shade val="98000"/>
+                <a:lumMod val="102000"/>
+              </a:schemeClr>
+            </a:gs>
+            <a:gs pos="50000">
+              <a:schemeClr val="phClr">
+                <a:tint val="98000"/>
+                <a:satMod val="130000"/>
+                <a:shade val="90000"/>
+                <a:lumMod val="103000"/>
+              </a:schemeClr>
+            </a:gs>
+            <a:gs pos="100000">
+              <a:schemeClr val="phClr">
+                <a:shade val="63000"/>
+                <a:satMod val="120000"/>
+              </a:schemeClr>
+            </a:gs>
+          </a:gsLst>
+          <a:lin ang="5400000" scaled="false"/>
+        </a:gradFill>
+      </a:bgFillStyleLst>
+    </a:fmtScheme>
+  </a:themeElements>
+  <a:objectDefaults/>
+  <a:extraClrSchemeLst/>
+</a:theme>
 </file>
</xml_diff>